<commit_message>
Agregando enlaces y ajuste de tabla de contenidos
</commit_message>
<xml_diff>
--- a/informe/Articulo Final_Learning Analytics y Machine Learning para la Predicción del Desempeño Académico.docx
+++ b/informe/Articulo Final_Learning Analytics y Machine Learning para la Predicción del Desempeño Académico.docx
@@ -590,9 +590,15 @@
     <w:p>
       <w:pPr>
         <w:pStyle w:val="Ttulo1"/>
-      </w:pPr>
-      <w:bookmarkStart w:id="0" w:name="_Toc234311711"/>
-      <w:r>
+        <w:rPr>
+          <w:lang w:val="es-DO"/>
+        </w:rPr>
+      </w:pPr>
+      <w:bookmarkStart w:id="0" w:name="_Toc234658210"/>
+      <w:r>
+        <w:rPr>
+          <w:lang w:val="es-DO"/>
+        </w:rPr>
         <w:lastRenderedPageBreak/>
         <w:t>Resumen</w:t>
       </w:r>
@@ -911,7 +917,7 @@
       <w:pPr>
         <w:pStyle w:val="Ttulo1"/>
       </w:pPr>
-      <w:bookmarkStart w:id="1" w:name="_Toc234311712"/>
+      <w:bookmarkStart w:id="1" w:name="_Toc234658211"/>
       <w:r>
         <w:t>Abstract</w:t>
       </w:r>
@@ -1073,25 +1079,19 @@
         <w:p>
           <w:pPr>
             <w:pStyle w:val="TtuloTDC"/>
-            <w:jc w:val="center"/>
+            <w:spacing w:line="240" w:lineRule="auto"/>
             <w:rPr>
               <w:rFonts w:ascii="Times New Roman" w:hAnsi="Times New Roman" w:cs="Times New Roman"/>
-              <w:b/>
-              <w:bCs/>
-              <w:color w:val="000000" w:themeColor="text1"/>
-              <w:sz w:val="24"/>
-              <w:szCs w:val="24"/>
+              <w:sz w:val="22"/>
+              <w:szCs w:val="22"/>
               <w:lang w:val="es-ES"/>
             </w:rPr>
           </w:pPr>
           <w:r>
             <w:rPr>
               <w:rFonts w:ascii="Times New Roman" w:hAnsi="Times New Roman" w:cs="Times New Roman"/>
-              <w:b/>
-              <w:bCs/>
-              <w:color w:val="000000" w:themeColor="text1"/>
-              <w:sz w:val="24"/>
-              <w:szCs w:val="24"/>
+              <w:sz w:val="22"/>
+              <w:szCs w:val="22"/>
               <w:lang w:val="es-ES"/>
             </w:rPr>
             <w:t>Tabla de C</w:t>
@@ -1099,11 +1099,8 @@
           <w:r>
             <w:rPr>
               <w:rFonts w:ascii="Times New Roman" w:hAnsi="Times New Roman" w:cs="Times New Roman"/>
-              <w:b/>
-              <w:bCs/>
-              <w:color w:val="000000" w:themeColor="text1"/>
-              <w:sz w:val="24"/>
-              <w:szCs w:val="24"/>
+              <w:sz w:val="22"/>
+              <w:szCs w:val="22"/>
               <w:lang w:val="es-ES"/>
             </w:rPr>
             <w:t>ontenido</w:t>
@@ -1111,11 +1108,8 @@
           <w:r>
             <w:rPr>
               <w:rFonts w:ascii="Times New Roman" w:hAnsi="Times New Roman" w:cs="Times New Roman"/>
-              <w:b/>
-              <w:bCs/>
-              <w:color w:val="000000" w:themeColor="text1"/>
-              <w:sz w:val="24"/>
-              <w:szCs w:val="24"/>
+              <w:sz w:val="22"/>
+              <w:szCs w:val="22"/>
               <w:lang w:val="es-ES"/>
             </w:rPr>
             <w:t>s</w:t>
@@ -1149,7 +1143,7 @@
           <w:pPr>
             <w:pStyle w:val="TDC1"/>
             <w:tabs>
-              <w:tab w:val="right" w:leader="dot" w:pos="8494"/>
+              <w:tab w:val="right" w:leader="dot" w:pos="9394"/>
             </w:tabs>
             <w:spacing w:line="240" w:lineRule="auto"/>
             <w:rPr>
@@ -1176,7 +1170,7 @@
             </w:rPr>
             <w:fldChar w:fldCharType="separate"/>
           </w:r>
-          <w:hyperlink w:anchor="_Toc234311711" w:history="1">
+          <w:hyperlink w:anchor="_Toc234658210" w:history="1">
             <w:r>
               <w:rPr>
                 <w:rStyle w:val="Hipervnculo"/>
@@ -1207,7 +1201,7 @@
                 <w:noProof/>
                 <w:webHidden/>
               </w:rPr>
-              <w:instrText xml:space="preserve"> PAGEREF _Toc234311711 \h </w:instrText>
+              <w:instrText xml:space="preserve"> PAGEREF _Toc234658210 \h </w:instrText>
             </w:r>
             <w:r>
               <w:rPr>
@@ -1246,7 +1240,7 @@
           <w:pPr>
             <w:pStyle w:val="TDC1"/>
             <w:tabs>
-              <w:tab w:val="right" w:leader="dot" w:pos="8494"/>
+              <w:tab w:val="right" w:leader="dot" w:pos="9394"/>
             </w:tabs>
             <w:spacing w:line="240" w:lineRule="auto"/>
             <w:rPr>
@@ -1255,7 +1249,7 @@
               <w:lang w:eastAsia="es-DO"/>
             </w:rPr>
           </w:pPr>
-          <w:hyperlink w:anchor="_Toc234311712" w:history="1">
+          <w:hyperlink w:anchor="_Toc234658211" w:history="1">
             <w:r>
               <w:rPr>
                 <w:rStyle w:val="Hipervnculo"/>
@@ -1286,7 +1280,7 @@
                 <w:noProof/>
                 <w:webHidden/>
               </w:rPr>
-              <w:instrText xml:space="preserve"> PAGEREF _Toc234311712 \h </w:instrText>
+              <w:instrText xml:space="preserve"> PAGEREF _Toc234658211 \h </w:instrText>
             </w:r>
             <w:r>
               <w:rPr>
@@ -1325,7 +1319,7 @@
           <w:pPr>
             <w:pStyle w:val="TDC1"/>
             <w:tabs>
-              <w:tab w:val="right" w:leader="dot" w:pos="8494"/>
+              <w:tab w:val="right" w:leader="dot" w:pos="9394"/>
             </w:tabs>
             <w:spacing w:line="240" w:lineRule="auto"/>
             <w:rPr>
@@ -1334,7 +1328,7 @@
               <w:lang w:eastAsia="es-DO"/>
             </w:rPr>
           </w:pPr>
-          <w:hyperlink w:anchor="_Toc234311713" w:history="1">
+          <w:hyperlink w:anchor="_Toc234658212" w:history="1">
             <w:r>
               <w:rPr>
                 <w:rStyle w:val="Hipervnculo"/>
@@ -1365,7 +1359,7 @@
                 <w:noProof/>
                 <w:webHidden/>
               </w:rPr>
-              <w:instrText xml:space="preserve"> PAGEREF _Toc234311713 \h </w:instrText>
+              <w:instrText xml:space="preserve"> PAGEREF _Toc234658212 \h </w:instrText>
             </w:r>
             <w:r>
               <w:rPr>
@@ -1404,7 +1398,7 @@
           <w:pPr>
             <w:pStyle w:val="TDC1"/>
             <w:tabs>
-              <w:tab w:val="right" w:leader="dot" w:pos="8494"/>
+              <w:tab w:val="right" w:leader="dot" w:pos="9394"/>
             </w:tabs>
             <w:spacing w:line="240" w:lineRule="auto"/>
             <w:rPr>
@@ -1413,7 +1407,7 @@
               <w:lang w:eastAsia="es-DO"/>
             </w:rPr>
           </w:pPr>
-          <w:hyperlink w:anchor="_Toc234311714" w:history="1">
+          <w:hyperlink w:anchor="_Toc234658213" w:history="1">
             <w:r>
               <w:rPr>
                 <w:rStyle w:val="Hipervnculo"/>
@@ -1444,7 +1438,7 @@
                 <w:noProof/>
                 <w:webHidden/>
               </w:rPr>
-              <w:instrText xml:space="preserve"> PAGEREF _Toc234311714 \h </w:instrText>
+              <w:instrText xml:space="preserve"> PAGEREF _Toc234658213 \h </w:instrText>
             </w:r>
             <w:r>
               <w:rPr>
@@ -1483,7 +1477,7 @@
           <w:pPr>
             <w:pStyle w:val="TDC1"/>
             <w:tabs>
-              <w:tab w:val="right" w:leader="dot" w:pos="8494"/>
+              <w:tab w:val="right" w:leader="dot" w:pos="9394"/>
             </w:tabs>
             <w:spacing w:line="240" w:lineRule="auto"/>
             <w:rPr>
@@ -1492,7 +1486,7 @@
               <w:lang w:eastAsia="es-DO"/>
             </w:rPr>
           </w:pPr>
-          <w:hyperlink w:anchor="_Toc234311715" w:history="1">
+          <w:hyperlink w:anchor="_Toc234658214" w:history="1">
             <w:r>
               <w:rPr>
                 <w:rStyle w:val="Hipervnculo"/>
@@ -1523,7 +1517,7 @@
                 <w:noProof/>
                 <w:webHidden/>
               </w:rPr>
-              <w:instrText xml:space="preserve"> PAGEREF _Toc234311715 \h </w:instrText>
+              <w:instrText xml:space="preserve"> PAGEREF _Toc234658214 \h </w:instrText>
             </w:r>
             <w:r>
               <w:rPr>
@@ -1562,7 +1556,7 @@
           <w:pPr>
             <w:pStyle w:val="TDC1"/>
             <w:tabs>
-              <w:tab w:val="right" w:leader="dot" w:pos="8494"/>
+              <w:tab w:val="right" w:leader="dot" w:pos="9394"/>
             </w:tabs>
             <w:spacing w:line="240" w:lineRule="auto"/>
             <w:rPr>
@@ -1571,7 +1565,7 @@
               <w:lang w:eastAsia="es-DO"/>
             </w:rPr>
           </w:pPr>
-          <w:hyperlink w:anchor="_Toc234311716" w:history="1">
+          <w:hyperlink w:anchor="_Toc234658215" w:history="1">
             <w:r>
               <w:rPr>
                 <w:rStyle w:val="Hipervnculo"/>
@@ -1602,7 +1596,7 @@
                 <w:noProof/>
                 <w:webHidden/>
               </w:rPr>
-              <w:instrText xml:space="preserve"> PAGEREF _Toc234311716 \h </w:instrText>
+              <w:instrText xml:space="preserve"> PAGEREF _Toc234658215 \h </w:instrText>
             </w:r>
             <w:r>
               <w:rPr>
@@ -1641,7 +1635,7 @@
           <w:pPr>
             <w:pStyle w:val="TDC1"/>
             <w:tabs>
-              <w:tab w:val="right" w:leader="dot" w:pos="8494"/>
+              <w:tab w:val="right" w:leader="dot" w:pos="9394"/>
             </w:tabs>
             <w:spacing w:line="240" w:lineRule="auto"/>
             <w:rPr>
@@ -1650,7 +1644,7 @@
               <w:lang w:eastAsia="es-DO"/>
             </w:rPr>
           </w:pPr>
-          <w:hyperlink w:anchor="_Toc234311717" w:history="1">
+          <w:hyperlink w:anchor="_Toc234658216" w:history="1">
             <w:r>
               <w:rPr>
                 <w:rStyle w:val="Hipervnculo"/>
@@ -1681,7 +1675,7 @@
                 <w:noProof/>
                 <w:webHidden/>
               </w:rPr>
-              <w:instrText xml:space="preserve"> PAGEREF _Toc234311717 \h </w:instrText>
+              <w:instrText xml:space="preserve"> PAGEREF _Toc234658216 \h </w:instrText>
             </w:r>
             <w:r>
               <w:rPr>
@@ -1720,7 +1714,7 @@
           <w:pPr>
             <w:pStyle w:val="TDC1"/>
             <w:tabs>
-              <w:tab w:val="right" w:leader="dot" w:pos="8494"/>
+              <w:tab w:val="right" w:leader="dot" w:pos="9394"/>
             </w:tabs>
             <w:spacing w:line="240" w:lineRule="auto"/>
             <w:rPr>
@@ -1729,7 +1723,7 @@
               <w:lang w:eastAsia="es-DO"/>
             </w:rPr>
           </w:pPr>
-          <w:hyperlink w:anchor="_Toc234311718" w:history="1">
+          <w:hyperlink w:anchor="_Toc234658217" w:history="1">
             <w:r>
               <w:rPr>
                 <w:rStyle w:val="Hipervnculo"/>
@@ -1760,7 +1754,7 @@
                 <w:noProof/>
                 <w:webHidden/>
               </w:rPr>
-              <w:instrText xml:space="preserve"> PAGEREF _Toc234311718 \h </w:instrText>
+              <w:instrText xml:space="preserve"> PAGEREF _Toc234658217 \h </w:instrText>
             </w:r>
             <w:r>
               <w:rPr>
@@ -1799,7 +1793,7 @@
           <w:pPr>
             <w:pStyle w:val="TDC1"/>
             <w:tabs>
-              <w:tab w:val="right" w:leader="dot" w:pos="8494"/>
+              <w:tab w:val="right" w:leader="dot" w:pos="9394"/>
             </w:tabs>
             <w:spacing w:line="240" w:lineRule="auto"/>
             <w:rPr>
@@ -1808,7 +1802,7 @@
               <w:lang w:eastAsia="es-DO"/>
             </w:rPr>
           </w:pPr>
-          <w:hyperlink w:anchor="_Toc234311719" w:history="1">
+          <w:hyperlink w:anchor="_Toc234658218" w:history="1">
             <w:r>
               <w:rPr>
                 <w:rStyle w:val="Hipervnculo"/>
@@ -1839,7 +1833,7 @@
                 <w:noProof/>
                 <w:webHidden/>
               </w:rPr>
-              <w:instrText xml:space="preserve"> PAGEREF _Toc234311719 \h </w:instrText>
+              <w:instrText xml:space="preserve"> PAGEREF _Toc234658218 \h </w:instrText>
             </w:r>
             <w:r>
               <w:rPr>
@@ -1878,7 +1872,7 @@
           <w:pPr>
             <w:pStyle w:val="TDC1"/>
             <w:tabs>
-              <w:tab w:val="right" w:leader="dot" w:pos="8494"/>
+              <w:tab w:val="right" w:leader="dot" w:pos="9394"/>
             </w:tabs>
             <w:spacing w:line="240" w:lineRule="auto"/>
             <w:rPr>
@@ -1887,7 +1881,7 @@
               <w:lang w:eastAsia="es-DO"/>
             </w:rPr>
           </w:pPr>
-          <w:hyperlink w:anchor="_Toc234311720" w:history="1">
+          <w:hyperlink w:anchor="_Toc234658219" w:history="1">
             <w:r>
               <w:rPr>
                 <w:rStyle w:val="Hipervnculo"/>
@@ -1918,7 +1912,7 @@
                 <w:noProof/>
                 <w:webHidden/>
               </w:rPr>
-              <w:instrText xml:space="preserve"> PAGEREF _Toc234311720 \h </w:instrText>
+              <w:instrText xml:space="preserve"> PAGEREF _Toc234658219 \h </w:instrText>
             </w:r>
             <w:r>
               <w:rPr>
@@ -1941,7 +1935,7 @@
                 <w:noProof/>
                 <w:webHidden/>
               </w:rPr>
-              <w:t>5</w:t>
+              <w:t>4</w:t>
             </w:r>
             <w:r>
               <w:rPr>
@@ -1957,7 +1951,7 @@
           <w:pPr>
             <w:pStyle w:val="TDC1"/>
             <w:tabs>
-              <w:tab w:val="right" w:leader="dot" w:pos="8494"/>
+              <w:tab w:val="right" w:leader="dot" w:pos="9394"/>
             </w:tabs>
             <w:spacing w:line="240" w:lineRule="auto"/>
             <w:rPr>
@@ -1966,7 +1960,7 @@
               <w:lang w:eastAsia="es-DO"/>
             </w:rPr>
           </w:pPr>
-          <w:hyperlink w:anchor="_Toc234311721" w:history="1">
+          <w:hyperlink w:anchor="_Toc234658220" w:history="1">
             <w:r>
               <w:rPr>
                 <w:rStyle w:val="Hipervnculo"/>
@@ -1997,7 +1991,7 @@
                 <w:noProof/>
                 <w:webHidden/>
               </w:rPr>
-              <w:instrText xml:space="preserve"> PAGEREF _Toc234311721 \h </w:instrText>
+              <w:instrText xml:space="preserve"> PAGEREF _Toc234658220 \h </w:instrText>
             </w:r>
             <w:r>
               <w:rPr>
@@ -2036,7 +2030,7 @@
           <w:pPr>
             <w:pStyle w:val="TDC1"/>
             <w:tabs>
-              <w:tab w:val="right" w:leader="dot" w:pos="8494"/>
+              <w:tab w:val="right" w:leader="dot" w:pos="9394"/>
             </w:tabs>
             <w:spacing w:line="240" w:lineRule="auto"/>
             <w:rPr>
@@ -2045,7 +2039,7 @@
               <w:lang w:eastAsia="es-DO"/>
             </w:rPr>
           </w:pPr>
-          <w:hyperlink w:anchor="_Toc234311722" w:history="1">
+          <w:hyperlink w:anchor="_Toc234658221" w:history="1">
             <w:r>
               <w:rPr>
                 <w:rStyle w:val="Hipervnculo"/>
@@ -2076,7 +2070,7 @@
                 <w:noProof/>
                 <w:webHidden/>
               </w:rPr>
-              <w:instrText xml:space="preserve"> PAGEREF _Toc234311722 \h </w:instrText>
+              <w:instrText xml:space="preserve"> PAGEREF _Toc234658221 \h </w:instrText>
             </w:r>
             <w:r>
               <w:rPr>
@@ -2115,7 +2109,7 @@
           <w:pPr>
             <w:pStyle w:val="TDC1"/>
             <w:tabs>
-              <w:tab w:val="right" w:leader="dot" w:pos="8494"/>
+              <w:tab w:val="right" w:leader="dot" w:pos="9394"/>
             </w:tabs>
             <w:spacing w:line="240" w:lineRule="auto"/>
             <w:rPr>
@@ -2124,7 +2118,7 @@
               <w:lang w:eastAsia="es-DO"/>
             </w:rPr>
           </w:pPr>
-          <w:hyperlink w:anchor="_Toc234311723" w:history="1">
+          <w:hyperlink w:anchor="_Toc234658222" w:history="1">
             <w:r>
               <w:rPr>
                 <w:rStyle w:val="Hipervnculo"/>
@@ -2155,7 +2149,7 @@
                 <w:noProof/>
                 <w:webHidden/>
               </w:rPr>
-              <w:instrText xml:space="preserve"> PAGEREF _Toc234311723 \h </w:instrText>
+              <w:instrText xml:space="preserve"> PAGEREF _Toc234658222 \h </w:instrText>
             </w:r>
             <w:r>
               <w:rPr>
@@ -2194,7 +2188,7 @@
           <w:pPr>
             <w:pStyle w:val="TDC1"/>
             <w:tabs>
-              <w:tab w:val="right" w:leader="dot" w:pos="8494"/>
+              <w:tab w:val="right" w:leader="dot" w:pos="9394"/>
             </w:tabs>
             <w:spacing w:line="240" w:lineRule="auto"/>
             <w:rPr>
@@ -2203,7 +2197,7 @@
               <w:lang w:eastAsia="es-DO"/>
             </w:rPr>
           </w:pPr>
-          <w:hyperlink w:anchor="_Toc234311724" w:history="1">
+          <w:hyperlink w:anchor="_Toc234658223" w:history="1">
             <w:r>
               <w:rPr>
                 <w:rStyle w:val="Hipervnculo"/>
@@ -2234,7 +2228,7 @@
                 <w:noProof/>
                 <w:webHidden/>
               </w:rPr>
-              <w:instrText xml:space="preserve"> PAGEREF _Toc234311724 \h </w:instrText>
+              <w:instrText xml:space="preserve"> PAGEREF _Toc234658223 \h </w:instrText>
             </w:r>
             <w:r>
               <w:rPr>
@@ -2273,7 +2267,7 @@
           <w:pPr>
             <w:pStyle w:val="TDC1"/>
             <w:tabs>
-              <w:tab w:val="right" w:leader="dot" w:pos="8494"/>
+              <w:tab w:val="right" w:leader="dot" w:pos="9394"/>
             </w:tabs>
             <w:spacing w:line="240" w:lineRule="auto"/>
             <w:rPr>
@@ -2282,7 +2276,7 @@
               <w:lang w:eastAsia="es-DO"/>
             </w:rPr>
           </w:pPr>
-          <w:hyperlink w:anchor="_Toc234311725" w:history="1">
+          <w:hyperlink w:anchor="_Toc234658224" w:history="1">
             <w:r>
               <w:rPr>
                 <w:rStyle w:val="Hipervnculo"/>
@@ -2313,7 +2307,7 @@
                 <w:noProof/>
                 <w:webHidden/>
               </w:rPr>
-              <w:instrText xml:space="preserve"> PAGEREF _Toc234311725 \h </w:instrText>
+              <w:instrText xml:space="preserve"> PAGEREF _Toc234658224 \h </w:instrText>
             </w:r>
             <w:r>
               <w:rPr>
@@ -2352,7 +2346,7 @@
           <w:pPr>
             <w:pStyle w:val="TDC1"/>
             <w:tabs>
-              <w:tab w:val="right" w:leader="dot" w:pos="8494"/>
+              <w:tab w:val="right" w:leader="dot" w:pos="9394"/>
             </w:tabs>
             <w:spacing w:line="240" w:lineRule="auto"/>
             <w:rPr>
@@ -2361,7 +2355,7 @@
               <w:lang w:eastAsia="es-DO"/>
             </w:rPr>
           </w:pPr>
-          <w:hyperlink w:anchor="_Toc234311726" w:history="1">
+          <w:hyperlink w:anchor="_Toc234658225" w:history="1">
             <w:r>
               <w:rPr>
                 <w:rStyle w:val="Hipervnculo"/>
@@ -2392,7 +2386,7 @@
                 <w:noProof/>
                 <w:webHidden/>
               </w:rPr>
-              <w:instrText xml:space="preserve"> PAGEREF _Toc234311726 \h </w:instrText>
+              <w:instrText xml:space="preserve"> PAGEREF _Toc234658225 \h </w:instrText>
             </w:r>
             <w:r>
               <w:rPr>
@@ -2431,7 +2425,7 @@
           <w:pPr>
             <w:pStyle w:val="TDC1"/>
             <w:tabs>
-              <w:tab w:val="right" w:leader="dot" w:pos="8494"/>
+              <w:tab w:val="right" w:leader="dot" w:pos="9394"/>
             </w:tabs>
             <w:spacing w:line="240" w:lineRule="auto"/>
             <w:rPr>
@@ -2440,7 +2434,7 @@
               <w:lang w:eastAsia="es-DO"/>
             </w:rPr>
           </w:pPr>
-          <w:hyperlink w:anchor="_Toc234311727" w:history="1">
+          <w:hyperlink w:anchor="_Toc234658226" w:history="1">
             <w:r>
               <w:rPr>
                 <w:rStyle w:val="Hipervnculo"/>
@@ -2471,7 +2465,7 @@
                 <w:noProof/>
                 <w:webHidden/>
               </w:rPr>
-              <w:instrText xml:space="preserve"> PAGEREF _Toc234311727 \h </w:instrText>
+              <w:instrText xml:space="preserve"> PAGEREF _Toc234658226 \h </w:instrText>
             </w:r>
             <w:r>
               <w:rPr>
@@ -2510,7 +2504,7 @@
           <w:pPr>
             <w:pStyle w:val="TDC1"/>
             <w:tabs>
-              <w:tab w:val="right" w:leader="dot" w:pos="8494"/>
+              <w:tab w:val="right" w:leader="dot" w:pos="9394"/>
             </w:tabs>
             <w:spacing w:line="240" w:lineRule="auto"/>
             <w:rPr>
@@ -2519,7 +2513,7 @@
               <w:lang w:eastAsia="es-DO"/>
             </w:rPr>
           </w:pPr>
-          <w:hyperlink w:anchor="_Toc234311728" w:history="1">
+          <w:hyperlink w:anchor="_Toc234658227" w:history="1">
             <w:r>
               <w:rPr>
                 <w:rStyle w:val="Hipervnculo"/>
@@ -2550,7 +2544,7 @@
                 <w:noProof/>
                 <w:webHidden/>
               </w:rPr>
-              <w:instrText xml:space="preserve"> PAGEREF _Toc234311728 \h </w:instrText>
+              <w:instrText xml:space="preserve"> PAGEREF _Toc234658227 \h </w:instrText>
             </w:r>
             <w:r>
               <w:rPr>
@@ -2589,7 +2583,7 @@
           <w:pPr>
             <w:pStyle w:val="TDC1"/>
             <w:tabs>
-              <w:tab w:val="right" w:leader="dot" w:pos="8494"/>
+              <w:tab w:val="right" w:leader="dot" w:pos="9394"/>
             </w:tabs>
             <w:spacing w:line="240" w:lineRule="auto"/>
             <w:rPr>
@@ -2598,7 +2592,7 @@
               <w:lang w:eastAsia="es-DO"/>
             </w:rPr>
           </w:pPr>
-          <w:hyperlink w:anchor="_Toc234311729" w:history="1">
+          <w:hyperlink w:anchor="_Toc234658228" w:history="1">
             <w:r>
               <w:rPr>
                 <w:rStyle w:val="Hipervnculo"/>
@@ -2629,7 +2623,7 @@
                 <w:noProof/>
                 <w:webHidden/>
               </w:rPr>
-              <w:instrText xml:space="preserve"> PAGEREF _Toc234311729 \h </w:instrText>
+              <w:instrText xml:space="preserve"> PAGEREF _Toc234658228 \h </w:instrText>
             </w:r>
             <w:r>
               <w:rPr>
@@ -2668,7 +2662,7 @@
           <w:pPr>
             <w:pStyle w:val="TDC3"/>
             <w:tabs>
-              <w:tab w:val="right" w:leader="dot" w:pos="8494"/>
+              <w:tab w:val="right" w:leader="dot" w:pos="9394"/>
             </w:tabs>
             <w:spacing w:line="240" w:lineRule="auto"/>
             <w:ind w:left="0"/>
@@ -2678,7 +2672,7 @@
               <w:lang w:eastAsia="es-DO"/>
             </w:rPr>
           </w:pPr>
-          <w:hyperlink w:anchor="_Toc234311730" w:history="1">
+          <w:hyperlink w:anchor="_Toc234658229" w:history="1">
             <w:r>
               <w:rPr>
                 <w:rStyle w:val="Hipervnculo"/>
@@ -2710,7 +2704,7 @@
                 <w:noProof/>
                 <w:webHidden/>
               </w:rPr>
-              <w:instrText xml:space="preserve"> PAGEREF _Toc234311730 \h </w:instrText>
+              <w:instrText xml:space="preserve"> PAGEREF _Toc234658229 \h </w:instrText>
             </w:r>
             <w:r>
               <w:rPr>
@@ -2749,7 +2743,7 @@
           <w:pPr>
             <w:pStyle w:val="TDC1"/>
             <w:tabs>
-              <w:tab w:val="right" w:leader="dot" w:pos="8494"/>
+              <w:tab w:val="right" w:leader="dot" w:pos="9394"/>
             </w:tabs>
             <w:spacing w:line="240" w:lineRule="auto"/>
             <w:rPr>
@@ -2758,7 +2752,7 @@
               <w:lang w:eastAsia="es-DO"/>
             </w:rPr>
           </w:pPr>
-          <w:hyperlink w:anchor="_Toc234311731" w:history="1">
+          <w:hyperlink w:anchor="_Toc234658230" w:history="1">
             <w:r>
               <w:rPr>
                 <w:rStyle w:val="Hipervnculo"/>
@@ -2789,7 +2783,7 @@
                 <w:noProof/>
                 <w:webHidden/>
               </w:rPr>
-              <w:instrText xml:space="preserve"> PAGEREF _Toc234311731 \h </w:instrText>
+              <w:instrText xml:space="preserve"> PAGEREF _Toc234658230 \h </w:instrText>
             </w:r>
             <w:r>
               <w:rPr>
@@ -2828,7 +2822,7 @@
           <w:pPr>
             <w:pStyle w:val="TDC3"/>
             <w:tabs>
-              <w:tab w:val="right" w:leader="dot" w:pos="8494"/>
+              <w:tab w:val="right" w:leader="dot" w:pos="9394"/>
             </w:tabs>
             <w:spacing w:line="240" w:lineRule="auto"/>
             <w:ind w:left="0"/>
@@ -2838,7 +2832,7 @@
               <w:lang w:eastAsia="es-DO"/>
             </w:rPr>
           </w:pPr>
-          <w:hyperlink w:anchor="_Toc234311732" w:history="1">
+          <w:hyperlink w:anchor="_Toc234658231" w:history="1">
             <w:r>
               <w:rPr>
                 <w:rStyle w:val="Hipervnculo"/>
@@ -2870,7 +2864,7 @@
                 <w:noProof/>
                 <w:webHidden/>
               </w:rPr>
-              <w:instrText xml:space="preserve"> PAGEREF _Toc234311732 \h </w:instrText>
+              <w:instrText xml:space="preserve"> PAGEREF _Toc234658231 \h </w:instrText>
             </w:r>
             <w:r>
               <w:rPr>
@@ -2909,7 +2903,7 @@
           <w:pPr>
             <w:pStyle w:val="TDC1"/>
             <w:tabs>
-              <w:tab w:val="right" w:leader="dot" w:pos="8494"/>
+              <w:tab w:val="right" w:leader="dot" w:pos="9394"/>
             </w:tabs>
             <w:spacing w:line="240" w:lineRule="auto"/>
             <w:rPr>
@@ -2918,7 +2912,7 @@
               <w:lang w:eastAsia="es-DO"/>
             </w:rPr>
           </w:pPr>
-          <w:hyperlink w:anchor="_Toc234311733" w:history="1">
+          <w:hyperlink w:anchor="_Toc234658232" w:history="1">
             <w:r>
               <w:rPr>
                 <w:rStyle w:val="Hipervnculo"/>
@@ -2949,7 +2943,7 @@
                 <w:noProof/>
                 <w:webHidden/>
               </w:rPr>
-              <w:instrText xml:space="preserve"> PAGEREF _Toc234311733 \h </w:instrText>
+              <w:instrText xml:space="preserve"> PAGEREF _Toc234658232 \h </w:instrText>
             </w:r>
             <w:r>
               <w:rPr>
@@ -2988,7 +2982,7 @@
           <w:pPr>
             <w:pStyle w:val="TDC3"/>
             <w:tabs>
-              <w:tab w:val="right" w:leader="dot" w:pos="8494"/>
+              <w:tab w:val="right" w:leader="dot" w:pos="9394"/>
             </w:tabs>
             <w:spacing w:line="240" w:lineRule="auto"/>
             <w:ind w:left="0"/>
@@ -2998,7 +2992,7 @@
               <w:lang w:eastAsia="es-DO"/>
             </w:rPr>
           </w:pPr>
-          <w:hyperlink w:anchor="_Toc234311734" w:history="1">
+          <w:hyperlink w:anchor="_Toc234658233" w:history="1">
             <w:r>
               <w:rPr>
                 <w:rStyle w:val="Hipervnculo"/>
@@ -3030,7 +3024,7 @@
                 <w:noProof/>
                 <w:webHidden/>
               </w:rPr>
-              <w:instrText xml:space="preserve"> PAGEREF _Toc234311734 \h </w:instrText>
+              <w:instrText xml:space="preserve"> PAGEREF _Toc234658233 \h </w:instrText>
             </w:r>
             <w:r>
               <w:rPr>
@@ -3069,7 +3063,7 @@
           <w:pPr>
             <w:pStyle w:val="TDC1"/>
             <w:tabs>
-              <w:tab w:val="right" w:leader="dot" w:pos="8494"/>
+              <w:tab w:val="right" w:leader="dot" w:pos="9394"/>
             </w:tabs>
             <w:spacing w:line="240" w:lineRule="auto"/>
             <w:rPr>
@@ -3078,7 +3072,7 @@
               <w:lang w:eastAsia="es-DO"/>
             </w:rPr>
           </w:pPr>
-          <w:hyperlink w:anchor="_Toc234311735" w:history="1">
+          <w:hyperlink w:anchor="_Toc234658234" w:history="1">
             <w:r>
               <w:rPr>
                 <w:rStyle w:val="Hipervnculo"/>
@@ -3109,7 +3103,7 @@
                 <w:noProof/>
                 <w:webHidden/>
               </w:rPr>
-              <w:instrText xml:space="preserve"> PAGEREF _Toc234311735 \h </w:instrText>
+              <w:instrText xml:space="preserve"> PAGEREF _Toc234658234 \h </w:instrText>
             </w:r>
             <w:r>
               <w:rPr>
@@ -3148,7 +3142,7 @@
           <w:pPr>
             <w:pStyle w:val="TDC1"/>
             <w:tabs>
-              <w:tab w:val="right" w:leader="dot" w:pos="8494"/>
+              <w:tab w:val="right" w:leader="dot" w:pos="9394"/>
             </w:tabs>
             <w:spacing w:line="240" w:lineRule="auto"/>
             <w:rPr>
@@ -3157,7 +3151,7 @@
               <w:lang w:eastAsia="es-DO"/>
             </w:rPr>
           </w:pPr>
-          <w:hyperlink w:anchor="_Toc234311736" w:history="1">
+          <w:hyperlink w:anchor="_Toc234658235" w:history="1">
             <w:r>
               <w:rPr>
                 <w:rStyle w:val="Hipervnculo"/>
@@ -3188,7 +3182,7 @@
                 <w:noProof/>
                 <w:webHidden/>
               </w:rPr>
-              <w:instrText xml:space="preserve"> PAGEREF _Toc234311736 \h </w:instrText>
+              <w:instrText xml:space="preserve"> PAGEREF _Toc234658235 \h </w:instrText>
             </w:r>
             <w:r>
               <w:rPr>
@@ -3227,7 +3221,7 @@
           <w:pPr>
             <w:pStyle w:val="TDC1"/>
             <w:tabs>
-              <w:tab w:val="right" w:leader="dot" w:pos="8494"/>
+              <w:tab w:val="right" w:leader="dot" w:pos="9394"/>
             </w:tabs>
             <w:spacing w:line="240" w:lineRule="auto"/>
             <w:rPr>
@@ -3236,7 +3230,7 @@
               <w:lang w:eastAsia="es-DO"/>
             </w:rPr>
           </w:pPr>
-          <w:hyperlink w:anchor="_Toc234311737" w:history="1">
+          <w:hyperlink w:anchor="_Toc234658236" w:history="1">
             <w:r>
               <w:rPr>
                 <w:rStyle w:val="Hipervnculo"/>
@@ -3267,7 +3261,7 @@
                 <w:noProof/>
                 <w:webHidden/>
               </w:rPr>
-              <w:instrText xml:space="preserve"> PAGEREF _Toc234311737 \h </w:instrText>
+              <w:instrText xml:space="preserve"> PAGEREF _Toc234658236 \h </w:instrText>
             </w:r>
             <w:r>
               <w:rPr>
@@ -3306,7 +3300,7 @@
           <w:pPr>
             <w:pStyle w:val="TDC1"/>
             <w:tabs>
-              <w:tab w:val="right" w:leader="dot" w:pos="8494"/>
+              <w:tab w:val="right" w:leader="dot" w:pos="9394"/>
             </w:tabs>
             <w:spacing w:line="240" w:lineRule="auto"/>
             <w:rPr>
@@ -3315,7 +3309,7 @@
               <w:lang w:eastAsia="es-DO"/>
             </w:rPr>
           </w:pPr>
-          <w:hyperlink w:anchor="_Toc234311738" w:history="1">
+          <w:hyperlink w:anchor="_Toc234658237" w:history="1">
             <w:r>
               <w:rPr>
                 <w:rStyle w:val="Hipervnculo"/>
@@ -3346,7 +3340,7 @@
                 <w:noProof/>
                 <w:webHidden/>
               </w:rPr>
-              <w:instrText xml:space="preserve"> PAGEREF _Toc234311738 \h </w:instrText>
+              <w:instrText xml:space="preserve"> PAGEREF _Toc234658237 \h </w:instrText>
             </w:r>
             <w:r>
               <w:rPr>
@@ -3385,7 +3379,7 @@
           <w:pPr>
             <w:pStyle w:val="TDC1"/>
             <w:tabs>
-              <w:tab w:val="right" w:leader="dot" w:pos="8494"/>
+              <w:tab w:val="right" w:leader="dot" w:pos="9394"/>
             </w:tabs>
             <w:spacing w:line="240" w:lineRule="auto"/>
             <w:rPr>
@@ -3394,7 +3388,7 @@
               <w:lang w:eastAsia="es-DO"/>
             </w:rPr>
           </w:pPr>
-          <w:hyperlink w:anchor="_Toc234311739" w:history="1">
+          <w:hyperlink w:anchor="_Toc234658238" w:history="1">
             <w:r>
               <w:rPr>
                 <w:rStyle w:val="Hipervnculo"/>
@@ -3425,7 +3419,7 @@
                 <w:noProof/>
                 <w:webHidden/>
               </w:rPr>
-              <w:instrText xml:space="preserve"> PAGEREF _Toc234311739 \h </w:instrText>
+              <w:instrText xml:space="preserve"> PAGEREF _Toc234658238 \h </w:instrText>
             </w:r>
             <w:r>
               <w:rPr>
@@ -3464,7 +3458,7 @@
           <w:pPr>
             <w:pStyle w:val="TDC1"/>
             <w:tabs>
-              <w:tab w:val="right" w:leader="dot" w:pos="8494"/>
+              <w:tab w:val="right" w:leader="dot" w:pos="9394"/>
             </w:tabs>
             <w:spacing w:line="240" w:lineRule="auto"/>
             <w:rPr>
@@ -3473,7 +3467,7 @@
               <w:lang w:eastAsia="es-DO"/>
             </w:rPr>
           </w:pPr>
-          <w:hyperlink w:anchor="_Toc234311740" w:history="1">
+          <w:hyperlink w:anchor="_Toc234658239" w:history="1">
             <w:r>
               <w:rPr>
                 <w:rStyle w:val="Hipervnculo"/>
@@ -3504,7 +3498,7 @@
                 <w:noProof/>
                 <w:webHidden/>
               </w:rPr>
-              <w:instrText xml:space="preserve"> PAGEREF _Toc234311740 \h </w:instrText>
+              <w:instrText xml:space="preserve"> PAGEREF _Toc234658239 \h </w:instrText>
             </w:r>
             <w:r>
               <w:rPr>
@@ -3543,7 +3537,7 @@
           <w:pPr>
             <w:pStyle w:val="TDC1"/>
             <w:tabs>
-              <w:tab w:val="right" w:leader="dot" w:pos="8494"/>
+              <w:tab w:val="right" w:leader="dot" w:pos="9394"/>
             </w:tabs>
             <w:spacing w:line="240" w:lineRule="auto"/>
             <w:rPr>
@@ -3552,7 +3546,7 @@
               <w:lang w:eastAsia="es-DO"/>
             </w:rPr>
           </w:pPr>
-          <w:hyperlink w:anchor="_Toc234311741" w:history="1">
+          <w:hyperlink w:anchor="_Toc234658240" w:history="1">
             <w:r>
               <w:rPr>
                 <w:rStyle w:val="Hipervnculo"/>
@@ -3583,7 +3577,7 @@
                 <w:noProof/>
                 <w:webHidden/>
               </w:rPr>
-              <w:instrText xml:space="preserve"> PAGEREF _Toc234311741 \h </w:instrText>
+              <w:instrText xml:space="preserve"> PAGEREF _Toc234658240 \h </w:instrText>
             </w:r>
             <w:r>
               <w:rPr>
@@ -3622,7 +3616,7 @@
           <w:pPr>
             <w:pStyle w:val="TDC1"/>
             <w:tabs>
-              <w:tab w:val="right" w:leader="dot" w:pos="8494"/>
+              <w:tab w:val="right" w:leader="dot" w:pos="9394"/>
             </w:tabs>
             <w:spacing w:line="240" w:lineRule="auto"/>
             <w:rPr>
@@ -3631,7 +3625,7 @@
               <w:lang w:eastAsia="es-DO"/>
             </w:rPr>
           </w:pPr>
-          <w:hyperlink w:anchor="_Toc234311742" w:history="1">
+          <w:hyperlink w:anchor="_Toc234658241" w:history="1">
             <w:r>
               <w:rPr>
                 <w:rStyle w:val="Hipervnculo"/>
@@ -3662,7 +3656,7 @@
                 <w:noProof/>
                 <w:webHidden/>
               </w:rPr>
-              <w:instrText xml:space="preserve"> PAGEREF _Toc234311742 \h </w:instrText>
+              <w:instrText xml:space="preserve"> PAGEREF _Toc234658241 \h </w:instrText>
             </w:r>
             <w:r>
               <w:rPr>
@@ -3701,7 +3695,7 @@
           <w:pPr>
             <w:pStyle w:val="TDC1"/>
             <w:tabs>
-              <w:tab w:val="right" w:leader="dot" w:pos="8494"/>
+              <w:tab w:val="right" w:leader="dot" w:pos="9394"/>
             </w:tabs>
             <w:spacing w:line="240" w:lineRule="auto"/>
             <w:rPr>
@@ -3710,7 +3704,7 @@
               <w:lang w:eastAsia="es-DO"/>
             </w:rPr>
           </w:pPr>
-          <w:hyperlink w:anchor="_Toc234311743" w:history="1">
+          <w:hyperlink w:anchor="_Toc234658242" w:history="1">
             <w:r>
               <w:rPr>
                 <w:rStyle w:val="Hipervnculo"/>
@@ -3741,7 +3735,7 @@
                 <w:noProof/>
                 <w:webHidden/>
               </w:rPr>
-              <w:instrText xml:space="preserve"> PAGEREF _Toc234311743 \h </w:instrText>
+              <w:instrText xml:space="preserve"> PAGEREF _Toc234658242 \h </w:instrText>
             </w:r>
             <w:r>
               <w:rPr>
@@ -3765,6 +3759,85 @@
                 <w:webHidden/>
               </w:rPr>
               <w:t>16</w:t>
+            </w:r>
+            <w:r>
+              <w:rPr>
+                <w:rFonts w:ascii="Times New Roman" w:hAnsi="Times New Roman" w:cs="Times New Roman"/>
+                <w:noProof/>
+                <w:webHidden/>
+              </w:rPr>
+              <w:fldChar w:fldCharType="end"/>
+            </w:r>
+          </w:hyperlink>
+        </w:p>
+        <w:p>
+          <w:pPr>
+            <w:pStyle w:val="TDC1"/>
+            <w:tabs>
+              <w:tab w:val="right" w:leader="dot" w:pos="9394"/>
+            </w:tabs>
+            <w:spacing w:line="240" w:lineRule="auto"/>
+            <w:rPr>
+              <w:rFonts w:ascii="Times New Roman" w:eastAsiaTheme="minorEastAsia" w:hAnsi="Times New Roman" w:cs="Times New Roman"/>
+              <w:noProof/>
+              <w:lang w:eastAsia="es-DO"/>
+            </w:rPr>
+          </w:pPr>
+          <w:hyperlink w:anchor="_Toc234658243" w:history="1">
+            <w:r>
+              <w:rPr>
+                <w:rStyle w:val="Hipervnculo"/>
+                <w:rFonts w:ascii="Times New Roman" w:hAnsi="Times New Roman" w:cs="Times New Roman"/>
+                <w:noProof/>
+              </w:rPr>
+              <w:t>Anexo F. Video grupal</w:t>
+            </w:r>
+            <w:r>
+              <w:rPr>
+                <w:rFonts w:ascii="Times New Roman" w:hAnsi="Times New Roman" w:cs="Times New Roman"/>
+                <w:noProof/>
+                <w:webHidden/>
+              </w:rPr>
+              <w:tab/>
+            </w:r>
+            <w:r>
+              <w:rPr>
+                <w:rFonts w:ascii="Times New Roman" w:hAnsi="Times New Roman" w:cs="Times New Roman"/>
+                <w:noProof/>
+                <w:webHidden/>
+              </w:rPr>
+              <w:fldChar w:fldCharType="begin"/>
+            </w:r>
+            <w:r>
+              <w:rPr>
+                <w:rFonts w:ascii="Times New Roman" w:hAnsi="Times New Roman" w:cs="Times New Roman"/>
+                <w:noProof/>
+                <w:webHidden/>
+              </w:rPr>
+              <w:instrText xml:space="preserve"> PAGEREF _Toc234658243 \h </w:instrText>
+            </w:r>
+            <w:r>
+              <w:rPr>
+                <w:rFonts w:ascii="Times New Roman" w:hAnsi="Times New Roman" w:cs="Times New Roman"/>
+                <w:noProof/>
+                <w:webHidden/>
+              </w:rPr>
+            </w:r>
+            <w:r>
+              <w:rPr>
+                <w:rFonts w:ascii="Times New Roman" w:hAnsi="Times New Roman" w:cs="Times New Roman"/>
+                <w:noProof/>
+                <w:webHidden/>
+              </w:rPr>
+              <w:fldChar w:fldCharType="separate"/>
+            </w:r>
+            <w:r>
+              <w:rPr>
+                <w:rFonts w:ascii="Times New Roman" w:hAnsi="Times New Roman" w:cs="Times New Roman"/>
+                <w:noProof/>
+                <w:webHidden/>
+              </w:rPr>
+              <w:t>17</w:t>
             </w:r>
             <w:r>
               <w:rPr>
@@ -3820,9 +3893,15 @@
     <w:p>
       <w:pPr>
         <w:pStyle w:val="Ttulo1"/>
-      </w:pPr>
-      <w:bookmarkStart w:id="2" w:name="_Toc234311713"/>
-      <w:r>
+        <w:rPr>
+          <w:lang w:val="es-DO"/>
+        </w:rPr>
+      </w:pPr>
+      <w:bookmarkStart w:id="2" w:name="_Toc234658212"/>
+      <w:r>
+        <w:rPr>
+          <w:lang w:val="es-DO"/>
+        </w:rPr>
         <w:lastRenderedPageBreak/>
         <w:t>Introducción</w:t>
       </w:r>
@@ -4273,9 +4352,15 @@
     <w:p>
       <w:pPr>
         <w:pStyle w:val="Ttulo1"/>
-      </w:pPr>
-      <w:bookmarkStart w:id="3" w:name="_Toc234311714"/>
-      <w:r>
+        <w:rPr>
+          <w:lang w:val="es-DO"/>
+        </w:rPr>
+      </w:pPr>
+      <w:bookmarkStart w:id="3" w:name="_Toc234658213"/>
+      <w:r>
+        <w:rPr>
+          <w:lang w:val="es-DO"/>
+        </w:rPr>
         <w:t>Revisión de la literatura</w:t>
       </w:r>
       <w:bookmarkEnd w:id="3"/>
@@ -4283,9 +4368,15 @@
     <w:p>
       <w:pPr>
         <w:pStyle w:val="Ttulo1"/>
-      </w:pPr>
-      <w:bookmarkStart w:id="4" w:name="_Toc234311715"/>
-      <w:r>
+        <w:rPr>
+          <w:lang w:val="es-DO"/>
+        </w:rPr>
+      </w:pPr>
+      <w:bookmarkStart w:id="4" w:name="_Toc234658214"/>
+      <w:r>
+        <w:rPr>
+          <w:lang w:val="es-DO"/>
+        </w:rPr>
         <w:t>Learning Analytics</w:t>
       </w:r>
       <w:bookmarkEnd w:id="4"/>
@@ -4327,7 +4418,7 @@
           <w:szCs w:val="24"/>
           <w:lang w:eastAsia="es-DO"/>
         </w:rPr>
-        <w:t xml:space="preserve"> constituye un campo interdisciplinario orientado a la recopilación, medición, análisis e interpretación de datos generados durante los procesos de enseñanza y aprendizaje con el propósito de comprender y optimizar el desempeño académico. Siemens y Baker (2012) establecen que el Learning Analytics integra conocimientos provenientes de la estadística, la minería de datos, la inteligencia artificial y las ciencias de la educación para apoyar la toma de decisiones basada en evidencia. En los últimos años, su importancia ha </w:t>
+        <w:t xml:space="preserve"> constituye un campo interdisciplinario orientado a la recopilación, medición, análisis e interpretación de datos generados durante los procesos de enseñanza y aprendizaje con el propósito de comprender y optimizar el desempeño académico. Siemens y Baker (2012) establecen que el Learning Analytics integra conocimientos provenientes de la estadística, la minería de datos, la inteligencia artificial y las ciencias de la educación para apoyar la toma de decisiones basada en evidencia. En los últimos años, su importancia ha aumentado debido a la expansión de los entornos virtuales de aprendizaje y a la disponibilidad de </w:t>
       </w:r>
       <w:r>
         <w:rPr>
@@ -4337,20 +4428,29 @@
           <w:lang w:eastAsia="es-DO"/>
         </w:rPr>
         <w:lastRenderedPageBreak/>
-        <w:t>aumentado debido a la expansión de los entornos virtuales de aprendizaje y a la disponibilidad de grandes volúmenes de datos educativos, permitiendo desarrollar sistemas de alerta temprana, personalizar el aprendizaje y mejorar la permanencia estudiantil (Lang et al., 2022; UNESCO, 2023).</w:t>
+        <w:t>grandes volúmenes de datos educativos, permitiendo desarrollar sistemas de alerta temprana, personalizar el aprendizaje y mejorar la permanencia estudiantil (Lang et al., 2022; UNESCO, 2023).</w:t>
       </w:r>
     </w:p>
     <w:p>
       <w:pPr>
         <w:pStyle w:val="Ttulo1"/>
-      </w:pPr>
-      <w:bookmarkStart w:id="5" w:name="_Toc234311716"/>
+        <w:rPr>
+          <w:lang w:val="es-DO"/>
+        </w:rPr>
+      </w:pPr>
+      <w:bookmarkStart w:id="5" w:name="_Toc234658215"/>
       <w:proofErr w:type="spellStart"/>
       <w:r>
+        <w:rPr>
+          <w:lang w:val="es-DO"/>
+        </w:rPr>
         <w:t>Educational</w:t>
       </w:r>
       <w:proofErr w:type="spellEnd"/>
       <w:r>
+        <w:rPr>
+          <w:lang w:val="es-DO"/>
+        </w:rPr>
         <w:t xml:space="preserve"> Data Mining</w:t>
       </w:r>
       <w:bookmarkEnd w:id="5"/>
@@ -4431,9 +4531,15 @@
     <w:p>
       <w:pPr>
         <w:pStyle w:val="Ttulo1"/>
-      </w:pPr>
-      <w:bookmarkStart w:id="6" w:name="_Toc234311717"/>
-      <w:r>
+        <w:rPr>
+          <w:lang w:val="es-DO"/>
+        </w:rPr>
+      </w:pPr>
+      <w:bookmarkStart w:id="6" w:name="_Toc234658216"/>
+      <w:r>
+        <w:rPr>
+          <w:lang w:val="es-DO"/>
+        </w:rPr>
         <w:t>Machine Learning aplicado a la educación</w:t>
       </w:r>
       <w:bookmarkEnd w:id="6"/>
@@ -4575,105 +4681,102 @@
           <w:szCs w:val="24"/>
           <w:lang w:eastAsia="es-DO"/>
         </w:rPr>
-        <w:t xml:space="preserve"> han demostrado un elevado desempeño en la clasificación de estudiantes según su probabilidad de éxito académico, favoreciendo el diseño de </w:t>
-      </w:r>
-      <w:r>
-        <w:rPr>
-          <w:rFonts w:ascii="Times New Roman" w:eastAsia="Times New Roman" w:hAnsi="Times New Roman" w:cs="Times New Roman"/>
-          <w:sz w:val="24"/>
-          <w:szCs w:val="24"/>
-          <w:lang w:eastAsia="es-DO"/>
+        <w:t xml:space="preserve"> han demostrado un elevado desempeño en la clasificación de estudiantes según su probabilidad de éxito académico, favoreciendo el diseño de estrategias de apoyo oportunas (Min et al., 2024; Stanford </w:t>
+      </w:r>
+      <w:proofErr w:type="spellStart"/>
+      <w:r>
+        <w:rPr>
+          <w:rFonts w:ascii="Times New Roman" w:eastAsia="Times New Roman" w:hAnsi="Times New Roman" w:cs="Times New Roman"/>
+          <w:sz w:val="24"/>
+          <w:szCs w:val="24"/>
+          <w:lang w:eastAsia="es-DO"/>
+        </w:rPr>
+        <w:t>Institute</w:t>
+      </w:r>
+      <w:proofErr w:type="spellEnd"/>
+      <w:r>
+        <w:rPr>
+          <w:rFonts w:ascii="Times New Roman" w:eastAsia="Times New Roman" w:hAnsi="Times New Roman" w:cs="Times New Roman"/>
+          <w:sz w:val="24"/>
+          <w:szCs w:val="24"/>
+          <w:lang w:eastAsia="es-DO"/>
+        </w:rPr>
+        <w:t xml:space="preserve"> </w:t>
+      </w:r>
+      <w:proofErr w:type="spellStart"/>
+      <w:r>
+        <w:rPr>
+          <w:rFonts w:ascii="Times New Roman" w:eastAsia="Times New Roman" w:hAnsi="Times New Roman" w:cs="Times New Roman"/>
+          <w:sz w:val="24"/>
+          <w:szCs w:val="24"/>
+          <w:lang w:eastAsia="es-DO"/>
+        </w:rPr>
+        <w:t>for</w:t>
+      </w:r>
+      <w:proofErr w:type="spellEnd"/>
+      <w:r>
+        <w:rPr>
+          <w:rFonts w:ascii="Times New Roman" w:eastAsia="Times New Roman" w:hAnsi="Times New Roman" w:cs="Times New Roman"/>
+          <w:sz w:val="24"/>
+          <w:szCs w:val="24"/>
+          <w:lang w:eastAsia="es-DO"/>
+        </w:rPr>
+        <w:t xml:space="preserve"> Human-</w:t>
+      </w:r>
+      <w:proofErr w:type="spellStart"/>
+      <w:r>
+        <w:rPr>
+          <w:rFonts w:ascii="Times New Roman" w:eastAsia="Times New Roman" w:hAnsi="Times New Roman" w:cs="Times New Roman"/>
+          <w:sz w:val="24"/>
+          <w:szCs w:val="24"/>
+          <w:lang w:eastAsia="es-DO"/>
+        </w:rPr>
+        <w:t>Centered</w:t>
+      </w:r>
+      <w:proofErr w:type="spellEnd"/>
+      <w:r>
+        <w:rPr>
+          <w:rFonts w:ascii="Times New Roman" w:eastAsia="Times New Roman" w:hAnsi="Times New Roman" w:cs="Times New Roman"/>
+          <w:sz w:val="24"/>
+          <w:szCs w:val="24"/>
+          <w:lang w:eastAsia="es-DO"/>
+        </w:rPr>
+        <w:t xml:space="preserve"> Artificial </w:t>
+      </w:r>
+      <w:proofErr w:type="spellStart"/>
+      <w:r>
+        <w:rPr>
+          <w:rFonts w:ascii="Times New Roman" w:eastAsia="Times New Roman" w:hAnsi="Times New Roman" w:cs="Times New Roman"/>
+          <w:sz w:val="24"/>
+          <w:szCs w:val="24"/>
+          <w:lang w:eastAsia="es-DO"/>
+        </w:rPr>
+        <w:t>Intelligence</w:t>
+      </w:r>
+      <w:proofErr w:type="spellEnd"/>
+      <w:r>
+        <w:rPr>
+          <w:rFonts w:ascii="Times New Roman" w:eastAsia="Times New Roman" w:hAnsi="Times New Roman" w:cs="Times New Roman"/>
+          <w:sz w:val="24"/>
+          <w:szCs w:val="24"/>
+          <w:lang w:eastAsia="es-DO"/>
+        </w:rPr>
+        <w:t xml:space="preserve"> [HAI], 2025).</w:t>
+      </w:r>
+    </w:p>
+    <w:p>
+      <w:pPr>
+        <w:pStyle w:val="Ttulo1"/>
+        <w:rPr>
+          <w:lang w:val="es-DO"/>
+        </w:rPr>
+      </w:pPr>
+      <w:bookmarkStart w:id="7" w:name="_Toc234658217"/>
+      <w:r>
+        <w:rPr>
+          <w:lang w:val="es-DO"/>
         </w:rPr>
         <w:lastRenderedPageBreak/>
-        <w:t xml:space="preserve">estrategias de apoyo oportunas (Min et al., 2024; Stanford </w:t>
-      </w:r>
-      <w:proofErr w:type="spellStart"/>
-      <w:r>
-        <w:rPr>
-          <w:rFonts w:ascii="Times New Roman" w:eastAsia="Times New Roman" w:hAnsi="Times New Roman" w:cs="Times New Roman"/>
-          <w:sz w:val="24"/>
-          <w:szCs w:val="24"/>
-          <w:lang w:eastAsia="es-DO"/>
-        </w:rPr>
-        <w:t>Institute</w:t>
-      </w:r>
-      <w:proofErr w:type="spellEnd"/>
-      <w:r>
-        <w:rPr>
-          <w:rFonts w:ascii="Times New Roman" w:eastAsia="Times New Roman" w:hAnsi="Times New Roman" w:cs="Times New Roman"/>
-          <w:sz w:val="24"/>
-          <w:szCs w:val="24"/>
-          <w:lang w:eastAsia="es-DO"/>
-        </w:rPr>
-        <w:t xml:space="preserve"> </w:t>
-      </w:r>
-      <w:proofErr w:type="spellStart"/>
-      <w:r>
-        <w:rPr>
-          <w:rFonts w:ascii="Times New Roman" w:eastAsia="Times New Roman" w:hAnsi="Times New Roman" w:cs="Times New Roman"/>
-          <w:sz w:val="24"/>
-          <w:szCs w:val="24"/>
-          <w:lang w:eastAsia="es-DO"/>
-        </w:rPr>
-        <w:t>for</w:t>
-      </w:r>
-      <w:proofErr w:type="spellEnd"/>
-      <w:r>
-        <w:rPr>
-          <w:rFonts w:ascii="Times New Roman" w:eastAsia="Times New Roman" w:hAnsi="Times New Roman" w:cs="Times New Roman"/>
-          <w:sz w:val="24"/>
-          <w:szCs w:val="24"/>
-          <w:lang w:eastAsia="es-DO"/>
-        </w:rPr>
-        <w:t xml:space="preserve"> Human-</w:t>
-      </w:r>
-      <w:proofErr w:type="spellStart"/>
-      <w:r>
-        <w:rPr>
-          <w:rFonts w:ascii="Times New Roman" w:eastAsia="Times New Roman" w:hAnsi="Times New Roman" w:cs="Times New Roman"/>
-          <w:sz w:val="24"/>
-          <w:szCs w:val="24"/>
-          <w:lang w:eastAsia="es-DO"/>
-        </w:rPr>
-        <w:t>Centered</w:t>
-      </w:r>
-      <w:proofErr w:type="spellEnd"/>
-      <w:r>
-        <w:rPr>
-          <w:rFonts w:ascii="Times New Roman" w:eastAsia="Times New Roman" w:hAnsi="Times New Roman" w:cs="Times New Roman"/>
-          <w:sz w:val="24"/>
-          <w:szCs w:val="24"/>
-          <w:lang w:eastAsia="es-DO"/>
-        </w:rPr>
-        <w:t xml:space="preserve"> Artificial </w:t>
-      </w:r>
-      <w:proofErr w:type="spellStart"/>
-      <w:r>
-        <w:rPr>
-          <w:rFonts w:ascii="Times New Roman" w:eastAsia="Times New Roman" w:hAnsi="Times New Roman" w:cs="Times New Roman"/>
-          <w:sz w:val="24"/>
-          <w:szCs w:val="24"/>
-          <w:lang w:eastAsia="es-DO"/>
-        </w:rPr>
-        <w:t>Intelligence</w:t>
-      </w:r>
-      <w:proofErr w:type="spellEnd"/>
-      <w:r>
-        <w:rPr>
-          <w:rFonts w:ascii="Times New Roman" w:eastAsia="Times New Roman" w:hAnsi="Times New Roman" w:cs="Times New Roman"/>
-          <w:sz w:val="24"/>
-          <w:szCs w:val="24"/>
-          <w:lang w:eastAsia="es-DO"/>
-        </w:rPr>
-        <w:t xml:space="preserve"> [HAI], 2025).</w:t>
-      </w:r>
-    </w:p>
-    <w:p>
-      <w:pPr>
-        <w:pStyle w:val="Ttulo1"/>
-      </w:pPr>
-      <w:bookmarkStart w:id="7" w:name="_Toc234311718"/>
-      <w:r>
         <w:t>Investigaciones sobre OULAD</w:t>
       </w:r>
       <w:bookmarkEnd w:id="7"/>
@@ -4859,9 +4962,15 @@
     <w:p>
       <w:pPr>
         <w:pStyle w:val="Ttulo1"/>
-      </w:pPr>
-      <w:bookmarkStart w:id="8" w:name="_Toc234311719"/>
-      <w:r>
+        <w:rPr>
+          <w:lang w:val="es-DO"/>
+        </w:rPr>
+      </w:pPr>
+      <w:bookmarkStart w:id="8" w:name="_Toc234658218"/>
+      <w:r>
+        <w:rPr>
+          <w:lang w:val="es-DO"/>
+        </w:rPr>
         <w:t>Metodología</w:t>
       </w:r>
       <w:bookmarkEnd w:id="8"/>
@@ -4900,10 +5009,15 @@
     <w:p>
       <w:pPr>
         <w:pStyle w:val="Ttulo1"/>
-      </w:pPr>
-      <w:bookmarkStart w:id="9" w:name="_Toc234311720"/>
-      <w:r>
-        <w:lastRenderedPageBreak/>
+        <w:rPr>
+          <w:lang w:val="es-DO"/>
+        </w:rPr>
+      </w:pPr>
+      <w:bookmarkStart w:id="9" w:name="_Toc234658219"/>
+      <w:r>
+        <w:rPr>
+          <w:lang w:val="es-DO"/>
+        </w:rPr>
         <w:t>Dataset OULAD</w:t>
       </w:r>
       <w:bookmarkEnd w:id="9"/>
@@ -4985,7 +5099,17 @@
           <w:szCs w:val="24"/>
           <w:lang w:eastAsia="es-DO"/>
         </w:rPr>
-        <w:t xml:space="preserve"> et al., 2017). Este dataset integra información demográfica, académica y de interacción digital de más de </w:t>
+        <w:t xml:space="preserve"> et al., 2017). Este </w:t>
+      </w:r>
+      <w:r>
+        <w:rPr>
+          <w:rFonts w:ascii="Times New Roman" w:eastAsia="Times New Roman" w:hAnsi="Times New Roman" w:cs="Times New Roman"/>
+          <w:sz w:val="24"/>
+          <w:szCs w:val="24"/>
+          <w:lang w:eastAsia="es-DO"/>
+        </w:rPr>
+        <w:lastRenderedPageBreak/>
+        <w:t xml:space="preserve">dataset integra información demográfica, académica y de interacción digital de más de </w:t>
       </w:r>
       <w:r>
         <w:rPr>
@@ -5009,9 +5133,15 @@
     <w:p>
       <w:pPr>
         <w:pStyle w:val="Ttulo1"/>
-      </w:pPr>
-      <w:bookmarkStart w:id="10" w:name="_Toc234311721"/>
-      <w:r>
+        <w:rPr>
+          <w:lang w:val="es-DO"/>
+        </w:rPr>
+      </w:pPr>
+      <w:bookmarkStart w:id="10" w:name="_Toc234658220"/>
+      <w:r>
+        <w:rPr>
+          <w:lang w:val="es-DO"/>
+        </w:rPr>
         <w:t>Variables</w:t>
       </w:r>
       <w:bookmarkEnd w:id="10"/>
@@ -5059,9 +5189,15 @@
     <w:p>
       <w:pPr>
         <w:pStyle w:val="Ttulo1"/>
-      </w:pPr>
-      <w:bookmarkStart w:id="11" w:name="_Toc234311722"/>
-      <w:r>
+        <w:rPr>
+          <w:lang w:val="es-DO"/>
+        </w:rPr>
+      </w:pPr>
+      <w:bookmarkStart w:id="11" w:name="_Toc234658221"/>
+      <w:r>
+        <w:rPr>
+          <w:lang w:val="es-DO"/>
+        </w:rPr>
         <w:t>Proceso OSEMN</w:t>
       </w:r>
       <w:bookmarkEnd w:id="11"/>
@@ -5234,7 +5370,47 @@
           <w:szCs w:val="24"/>
           <w:lang w:eastAsia="es-DO"/>
         </w:rPr>
-        <w:t xml:space="preserve"> comprendió la limpieza, transformación y codificación de variables, así como el tratamiento de valores faltantes e inconsistentes. </w:t>
+        <w:t xml:space="preserve"> comprendió la limpieza, transformación y codificación de variables, así como el tratamiento de valores faltantes e inconsistentes. Posteriormente, en Explore, se realizó el análisis exploratorio de datos mediante estadísticas descriptivas, visualizaciones y análisis de correlación. La etapa </w:t>
+      </w:r>
+      <w:proofErr w:type="spellStart"/>
+      <w:r>
+        <w:rPr>
+          <w:rFonts w:ascii="Times New Roman" w:eastAsia="Times New Roman" w:hAnsi="Times New Roman" w:cs="Times New Roman"/>
+          <w:sz w:val="24"/>
+          <w:szCs w:val="24"/>
+          <w:lang w:eastAsia="es-DO"/>
+        </w:rPr>
+        <w:t>Model</w:t>
+      </w:r>
+      <w:proofErr w:type="spellEnd"/>
+      <w:r>
+        <w:rPr>
+          <w:rFonts w:ascii="Times New Roman" w:eastAsia="Times New Roman" w:hAnsi="Times New Roman" w:cs="Times New Roman"/>
+          <w:sz w:val="24"/>
+          <w:szCs w:val="24"/>
+          <w:lang w:eastAsia="es-DO"/>
+        </w:rPr>
+        <w:t xml:space="preserve"> consistió en el entrenamiento y validación de los algoritmos de aprendizaje automático, mientras que </w:t>
+      </w:r>
+      <w:proofErr w:type="spellStart"/>
+      <w:r>
+        <w:rPr>
+          <w:rFonts w:ascii="Times New Roman" w:eastAsia="Times New Roman" w:hAnsi="Times New Roman" w:cs="Times New Roman"/>
+          <w:sz w:val="24"/>
+          <w:szCs w:val="24"/>
+          <w:lang w:eastAsia="es-DO"/>
+        </w:rPr>
+        <w:t>iNterpret</w:t>
+      </w:r>
+      <w:proofErr w:type="spellEnd"/>
+      <w:r>
+        <w:rPr>
+          <w:rFonts w:ascii="Times New Roman" w:eastAsia="Times New Roman" w:hAnsi="Times New Roman" w:cs="Times New Roman"/>
+          <w:sz w:val="24"/>
+          <w:szCs w:val="24"/>
+          <w:lang w:eastAsia="es-DO"/>
+        </w:rPr>
+        <w:t xml:space="preserve"> permitió interpretar los resultados, identificar las variables más relevantes y comparar el </w:t>
       </w:r>
       <w:r>
         <w:rPr>
@@ -5244,55 +5420,21 @@
           <w:lang w:eastAsia="es-DO"/>
         </w:rPr>
         <w:lastRenderedPageBreak/>
-        <w:t xml:space="preserve">Posteriormente, en Explore, se realizó el análisis exploratorio de datos mediante estadísticas descriptivas, visualizaciones y análisis de correlación. La etapa </w:t>
-      </w:r>
-      <w:proofErr w:type="spellStart"/>
-      <w:r>
-        <w:rPr>
-          <w:rFonts w:ascii="Times New Roman" w:eastAsia="Times New Roman" w:hAnsi="Times New Roman" w:cs="Times New Roman"/>
-          <w:sz w:val="24"/>
-          <w:szCs w:val="24"/>
-          <w:lang w:eastAsia="es-DO"/>
-        </w:rPr>
-        <w:t>Model</w:t>
-      </w:r>
-      <w:proofErr w:type="spellEnd"/>
-      <w:r>
-        <w:rPr>
-          <w:rFonts w:ascii="Times New Roman" w:eastAsia="Times New Roman" w:hAnsi="Times New Roman" w:cs="Times New Roman"/>
-          <w:sz w:val="24"/>
-          <w:szCs w:val="24"/>
-          <w:lang w:eastAsia="es-DO"/>
-        </w:rPr>
-        <w:t xml:space="preserve"> consistió en el entrenamiento y validación de los algoritmos de aprendizaje automático, mientras que </w:t>
-      </w:r>
-      <w:proofErr w:type="spellStart"/>
-      <w:r>
-        <w:rPr>
-          <w:rFonts w:ascii="Times New Roman" w:eastAsia="Times New Roman" w:hAnsi="Times New Roman" w:cs="Times New Roman"/>
-          <w:sz w:val="24"/>
-          <w:szCs w:val="24"/>
-          <w:lang w:eastAsia="es-DO"/>
-        </w:rPr>
-        <w:t>iNterpret</w:t>
-      </w:r>
-      <w:proofErr w:type="spellEnd"/>
-      <w:r>
-        <w:rPr>
-          <w:rFonts w:ascii="Times New Roman" w:eastAsia="Times New Roman" w:hAnsi="Times New Roman" w:cs="Times New Roman"/>
-          <w:sz w:val="24"/>
-          <w:szCs w:val="24"/>
-          <w:lang w:eastAsia="es-DO"/>
-        </w:rPr>
-        <w:t xml:space="preserve"> permitió interpretar los resultados, identificar las variables más relevantes y comparar el desempeño de los modelos.</w:t>
+        <w:t>desempeño de los modelos.</w:t>
       </w:r>
     </w:p>
     <w:p>
       <w:pPr>
         <w:pStyle w:val="Ttulo1"/>
-      </w:pPr>
-      <w:bookmarkStart w:id="12" w:name="_Toc234311723"/>
-      <w:r>
+        <w:rPr>
+          <w:lang w:val="es-DO"/>
+        </w:rPr>
+      </w:pPr>
+      <w:bookmarkStart w:id="12" w:name="_Toc234658222"/>
+      <w:r>
+        <w:rPr>
+          <w:lang w:val="es-DO"/>
+        </w:rPr>
         <w:t>Preprocesamiento de los datos</w:t>
       </w:r>
       <w:bookmarkEnd w:id="12"/>
@@ -5344,22 +5486,18 @@
     <w:p>
       <w:pPr>
         <w:pStyle w:val="Ttulo1"/>
-      </w:pPr>
-      <w:bookmarkStart w:id="13" w:name="_Toc234311724"/>
-      <w:proofErr w:type="spellStart"/>
-      <w:r>
-        <w:t>Algoritmos</w:t>
-      </w:r>
-      <w:proofErr w:type="spellEnd"/>
-      <w:r>
-        <w:t xml:space="preserve"> </w:t>
-      </w:r>
-      <w:proofErr w:type="spellStart"/>
-      <w:r>
-        <w:t>utilizados</w:t>
+        <w:rPr>
+          <w:lang w:val="es-DO"/>
+        </w:rPr>
+      </w:pPr>
+      <w:bookmarkStart w:id="13" w:name="_Toc234658223"/>
+      <w:r>
+        <w:rPr>
+          <w:lang w:val="es-DO"/>
+        </w:rPr>
+        <w:t>Algoritmos utilizados</w:t>
       </w:r>
       <w:bookmarkEnd w:id="13"/>
-      <w:proofErr w:type="spellEnd"/>
     </w:p>
     <w:p>
       <w:pPr>
@@ -5573,7 +5711,7 @@
       <w:pPr>
         <w:pStyle w:val="Ttulo1"/>
       </w:pPr>
-      <w:bookmarkStart w:id="14" w:name="_Toc234311725"/>
+      <w:bookmarkStart w:id="14" w:name="_Toc234658224"/>
       <w:proofErr w:type="spellStart"/>
       <w:r>
         <w:lastRenderedPageBreak/>
@@ -5686,26 +5824,41 @@
     <w:p>
       <w:pPr>
         <w:pStyle w:val="Ttulo1"/>
-      </w:pPr>
-      <w:bookmarkStart w:id="15" w:name="_Toc234311726"/>
+        <w:rPr>
+          <w:lang w:val="es-DO"/>
+        </w:rPr>
+      </w:pPr>
     </w:p>
     <w:p>
       <w:pPr>
         <w:pStyle w:val="Ttulo1"/>
+        <w:rPr>
+          <w:lang w:val="es-DO"/>
+        </w:rPr>
       </w:pPr>
     </w:p>
     <w:p>
       <w:pPr>
         <w:pStyle w:val="Ttulo1"/>
-      </w:pPr>
+        <w:rPr>
+          <w:lang w:val="es-DO"/>
+        </w:rPr>
+      </w:pPr>
+      <w:bookmarkStart w:id="15" w:name="_Toc234658225"/>
       <w:proofErr w:type="spellStart"/>
       <w:r>
+        <w:rPr>
+          <w:lang w:val="es-DO"/>
+        </w:rPr>
         <w:lastRenderedPageBreak/>
         <w:t>Findings</w:t>
       </w:r>
       <w:bookmarkEnd w:id="15"/>
       <w:proofErr w:type="spellEnd"/>
       <w:r>
+        <w:rPr>
+          <w:lang w:val="es-DO"/>
+        </w:rPr>
         <w:t xml:space="preserve"> </w:t>
       </w:r>
     </w:p>
@@ -5752,9 +5905,15 @@
     <w:p>
       <w:pPr>
         <w:pStyle w:val="Ttulo1"/>
-      </w:pPr>
-      <w:bookmarkStart w:id="16" w:name="_Toc234311727"/>
-      <w:r>
+        <w:rPr>
+          <w:lang w:val="es-DO"/>
+        </w:rPr>
+      </w:pPr>
+      <w:bookmarkStart w:id="16" w:name="_Toc234658226"/>
+      <w:r>
+        <w:rPr>
+          <w:lang w:val="es-DO"/>
+        </w:rPr>
         <w:t>Estadística descriptiva y análisis exploratorio de datos (EDA)</w:t>
       </w:r>
       <w:bookmarkEnd w:id="16"/>
@@ -5784,9 +5943,15 @@
     <w:p>
       <w:pPr>
         <w:pStyle w:val="Ttulo1"/>
-      </w:pPr>
-      <w:bookmarkStart w:id="17" w:name="_Toc234311728"/>
-      <w:r>
+        <w:rPr>
+          <w:lang w:val="es-DO"/>
+        </w:rPr>
+      </w:pPr>
+      <w:bookmarkStart w:id="17" w:name="_Toc234658227"/>
+      <w:r>
+        <w:rPr>
+          <w:lang w:val="es-DO"/>
+        </w:rPr>
         <w:t>Tabla 1</w:t>
       </w:r>
       <w:bookmarkEnd w:id="17"/>
@@ -6866,83 +7031,80 @@
           <w:szCs w:val="24"/>
           <w:lang w:eastAsia="es-DO"/>
         </w:rPr>
-        <w:t xml:space="preserve">El análisis exploratorio permitió identificar distribuciones asimétricas y diferencias significativas entre estudiantes con alto y bajo rendimiento. Asimismo, el análisis de correlación evidenció que la actividad desarrollada dentro del entorno virtual constituye uno de los principales predictores del desempeño académico, resultado consistente con investigaciones </w:t>
-      </w:r>
-      <w:r>
-        <w:rPr>
-          <w:rFonts w:ascii="Times New Roman" w:eastAsia="Times New Roman" w:hAnsi="Times New Roman" w:cs="Times New Roman"/>
-          <w:sz w:val="24"/>
-          <w:szCs w:val="24"/>
-          <w:lang w:eastAsia="es-DO"/>
+        <w:t xml:space="preserve">El análisis exploratorio permitió identificar distribuciones asimétricas y diferencias significativas entre estudiantes con alto y bajo rendimiento. Asimismo, el análisis de correlación evidenció que la actividad desarrollada dentro del entorno virtual constituye uno de los principales predictores del desempeño académico, resultado consistente con investigaciones previas sobre </w:t>
+      </w:r>
+      <w:r>
+        <w:rPr>
+          <w:rFonts w:ascii="Times New Roman" w:eastAsia="Times New Roman" w:hAnsi="Times New Roman" w:cs="Times New Roman"/>
+          <w:sz w:val="24"/>
+          <w:szCs w:val="24"/>
+          <w:lang w:eastAsia="es-DO"/>
+        </w:rPr>
+        <w:t>Learning Analytics</w:t>
+      </w:r>
+      <w:r>
+        <w:rPr>
+          <w:rFonts w:ascii="Times New Roman" w:eastAsia="Times New Roman" w:hAnsi="Times New Roman" w:cs="Times New Roman"/>
+          <w:sz w:val="24"/>
+          <w:szCs w:val="24"/>
+          <w:lang w:eastAsia="es-DO"/>
+        </w:rPr>
+        <w:t xml:space="preserve"> (</w:t>
+      </w:r>
+      <w:proofErr w:type="spellStart"/>
+      <w:r>
+        <w:rPr>
+          <w:rFonts w:ascii="Times New Roman" w:eastAsia="Times New Roman" w:hAnsi="Times New Roman" w:cs="Times New Roman"/>
+          <w:sz w:val="24"/>
+          <w:szCs w:val="24"/>
+          <w:lang w:eastAsia="es-DO"/>
+        </w:rPr>
+        <w:t>Macfadyen</w:t>
+      </w:r>
+      <w:proofErr w:type="spellEnd"/>
+      <w:r>
+        <w:rPr>
+          <w:rFonts w:ascii="Times New Roman" w:eastAsia="Times New Roman" w:hAnsi="Times New Roman" w:cs="Times New Roman"/>
+          <w:sz w:val="24"/>
+          <w:szCs w:val="24"/>
+          <w:lang w:eastAsia="es-DO"/>
+        </w:rPr>
+        <w:t xml:space="preserve"> &amp; Dawson, 2010; </w:t>
+      </w:r>
+      <w:proofErr w:type="spellStart"/>
+      <w:r>
+        <w:rPr>
+          <w:rFonts w:ascii="Times New Roman" w:eastAsia="Times New Roman" w:hAnsi="Times New Roman" w:cs="Times New Roman"/>
+          <w:sz w:val="24"/>
+          <w:szCs w:val="24"/>
+          <w:lang w:eastAsia="es-DO"/>
+        </w:rPr>
+        <w:t>Hlosta</w:t>
+      </w:r>
+      <w:proofErr w:type="spellEnd"/>
+      <w:r>
+        <w:rPr>
+          <w:rFonts w:ascii="Times New Roman" w:eastAsia="Times New Roman" w:hAnsi="Times New Roman" w:cs="Times New Roman"/>
+          <w:sz w:val="24"/>
+          <w:szCs w:val="24"/>
+          <w:lang w:eastAsia="es-DO"/>
+        </w:rPr>
+        <w:t xml:space="preserve"> et al., 2017).</w:t>
+      </w:r>
+    </w:p>
+    <w:p>
+      <w:pPr>
+        <w:pStyle w:val="Ttulo1"/>
+        <w:rPr>
+          <w:lang w:val="es-DO"/>
+        </w:rPr>
+      </w:pPr>
+      <w:bookmarkStart w:id="18" w:name="_Toc234658228"/>
+      <w:r>
+        <w:rPr>
+          <w:lang w:val="es-DO"/>
         </w:rPr>
         <w:lastRenderedPageBreak/>
-        <w:t xml:space="preserve">previas sobre </w:t>
-      </w:r>
-      <w:r>
-        <w:rPr>
-          <w:rFonts w:ascii="Times New Roman" w:eastAsia="Times New Roman" w:hAnsi="Times New Roman" w:cs="Times New Roman"/>
-          <w:sz w:val="24"/>
-          <w:szCs w:val="24"/>
-          <w:lang w:eastAsia="es-DO"/>
-        </w:rPr>
-        <w:t>Learning Analytics</w:t>
-      </w:r>
-      <w:r>
-        <w:rPr>
-          <w:rFonts w:ascii="Times New Roman" w:eastAsia="Times New Roman" w:hAnsi="Times New Roman" w:cs="Times New Roman"/>
-          <w:sz w:val="24"/>
-          <w:szCs w:val="24"/>
-          <w:lang w:eastAsia="es-DO"/>
-        </w:rPr>
-        <w:t xml:space="preserve"> (</w:t>
-      </w:r>
-      <w:proofErr w:type="spellStart"/>
-      <w:r>
-        <w:rPr>
-          <w:rFonts w:ascii="Times New Roman" w:eastAsia="Times New Roman" w:hAnsi="Times New Roman" w:cs="Times New Roman"/>
-          <w:sz w:val="24"/>
-          <w:szCs w:val="24"/>
-          <w:lang w:eastAsia="es-DO"/>
-        </w:rPr>
-        <w:t>Macfadyen</w:t>
-      </w:r>
-      <w:proofErr w:type="spellEnd"/>
-      <w:r>
-        <w:rPr>
-          <w:rFonts w:ascii="Times New Roman" w:eastAsia="Times New Roman" w:hAnsi="Times New Roman" w:cs="Times New Roman"/>
-          <w:sz w:val="24"/>
-          <w:szCs w:val="24"/>
-          <w:lang w:eastAsia="es-DO"/>
-        </w:rPr>
-        <w:t xml:space="preserve"> &amp; Dawson, 2010; </w:t>
-      </w:r>
-      <w:proofErr w:type="spellStart"/>
-      <w:r>
-        <w:rPr>
-          <w:rFonts w:ascii="Times New Roman" w:eastAsia="Times New Roman" w:hAnsi="Times New Roman" w:cs="Times New Roman"/>
-          <w:sz w:val="24"/>
-          <w:szCs w:val="24"/>
-          <w:lang w:eastAsia="es-DO"/>
-        </w:rPr>
-        <w:t>Hlosta</w:t>
-      </w:r>
-      <w:proofErr w:type="spellEnd"/>
-      <w:r>
-        <w:rPr>
-          <w:rFonts w:ascii="Times New Roman" w:eastAsia="Times New Roman" w:hAnsi="Times New Roman" w:cs="Times New Roman"/>
-          <w:sz w:val="24"/>
-          <w:szCs w:val="24"/>
-          <w:lang w:eastAsia="es-DO"/>
-        </w:rPr>
-        <w:t xml:space="preserve"> et al., 2017).</w:t>
-      </w:r>
-    </w:p>
-    <w:p>
-      <w:pPr>
-        <w:pStyle w:val="Ttulo1"/>
-      </w:pPr>
-      <w:bookmarkStart w:id="18" w:name="_Toc234311729"/>
-      <w:r>
         <w:t>Comparación de algoritmos de Machine Learning</w:t>
       </w:r>
       <w:bookmarkEnd w:id="18"/>
@@ -7090,7 +7252,7 @@
           <w:lang w:eastAsia="es-DO"/>
         </w:rPr>
       </w:pPr>
-      <w:bookmarkStart w:id="19" w:name="_Toc234311730"/>
+      <w:bookmarkStart w:id="19" w:name="_Toc234658229"/>
       <w:r>
         <w:rPr>
           <w:rFonts w:ascii="Times New Roman" w:eastAsia="Times New Roman" w:hAnsi="Times New Roman" w:cs="Times New Roman"/>
@@ -8125,9 +8287,15 @@
     <w:p>
       <w:pPr>
         <w:pStyle w:val="Ttulo1"/>
-      </w:pPr>
-      <w:bookmarkStart w:id="20" w:name="_Toc234311731"/>
-      <w:r>
+        <w:rPr>
+          <w:lang w:val="es-DO"/>
+        </w:rPr>
+      </w:pPr>
+      <w:bookmarkStart w:id="20" w:name="_Toc234658230"/>
+      <w:r>
+        <w:rPr>
+          <w:lang w:val="es-DO"/>
+        </w:rPr>
         <w:t>Matriz de confusión</w:t>
       </w:r>
       <w:bookmarkEnd w:id="20"/>
@@ -8262,7 +8430,6 @@
           <w:lang w:eastAsia="es-DO"/>
         </w:rPr>
       </w:pPr>
-      <w:bookmarkStart w:id="21" w:name="_Toc234311732"/>
     </w:p>
     <w:p>
       <w:pPr>
@@ -8308,6 +8475,7 @@
           <w:lang w:eastAsia="es-DO"/>
         </w:rPr>
       </w:pPr>
+      <w:bookmarkStart w:id="21" w:name="_Toc234658231"/>
       <w:r>
         <w:rPr>
           <w:rFonts w:ascii="Times New Roman" w:eastAsia="Times New Roman" w:hAnsi="Times New Roman" w:cs="Times New Roman"/>
@@ -8317,6 +8485,7 @@
           <w:szCs w:val="24"/>
           <w:lang w:eastAsia="es-DO"/>
         </w:rPr>
+        <w:lastRenderedPageBreak/>
         <w:t xml:space="preserve">Tabla </w:t>
       </w:r>
       <w:r>
@@ -8767,9 +8936,15 @@
     <w:p>
       <w:pPr>
         <w:pStyle w:val="Ttulo1"/>
-      </w:pPr>
-      <w:bookmarkStart w:id="22" w:name="_Toc234311733"/>
-      <w:r>
+        <w:rPr>
+          <w:lang w:val="es-DO"/>
+        </w:rPr>
+      </w:pPr>
+      <w:bookmarkStart w:id="22" w:name="_Toc234658232"/>
+      <w:r>
+        <w:rPr>
+          <w:lang w:val="es-DO"/>
+        </w:rPr>
         <w:t>Evaluación de las métricas predictivas</w:t>
       </w:r>
       <w:bookmarkEnd w:id="22"/>
@@ -8919,7 +9094,7 @@
           <w:lang w:eastAsia="es-DO"/>
         </w:rPr>
       </w:pPr>
-      <w:bookmarkStart w:id="23" w:name="_Toc234311734"/>
+      <w:bookmarkStart w:id="23" w:name="_Toc234658233"/>
       <w:r>
         <w:rPr>
           <w:rFonts w:ascii="Times New Roman" w:eastAsia="Times New Roman" w:hAnsi="Times New Roman" w:cs="Times New Roman"/>
@@ -9606,7 +9781,6 @@
         <w:ind w:firstLine="708"/>
       </w:pPr>
       <w:r>
-        <w:lastRenderedPageBreak/>
         <w:t xml:space="preserve">En conjunto, los resultados demuestran que la integración de </w:t>
       </w:r>
       <w:r>
@@ -9636,15 +9810,25 @@
         <w:t>Machine Learning</w:t>
       </w:r>
       <w:r>
-        <w:t xml:space="preserve"> constituye una estrategia efectiva para la predicción del desempeño académico. La identificación temprana de estudiantes con riesgo de bajo rendimiento puede contribuir al diseño de intervenciones oportunas y fortalecer la toma de decisiones basada en evidencia en instituciones de educación superior.</w:t>
+        <w:t xml:space="preserve"> constituye una estrategia efectiva para la predicción del desempeño académico. La identificación temprana de estudiantes con riesgo de bajo rendimiento puede </w:t>
+      </w:r>
+      <w:r>
+        <w:lastRenderedPageBreak/>
+        <w:t>contribuir al diseño de intervenciones oportunas y fortalecer la toma de decisiones basada en evidencia en instituciones de educación superior.</w:t>
       </w:r>
     </w:p>
     <w:p>
       <w:pPr>
         <w:pStyle w:val="Ttulo1"/>
-      </w:pPr>
-      <w:bookmarkStart w:id="24" w:name="_Toc234311735"/>
-      <w:r>
+        <w:rPr>
+          <w:lang w:val="es-DO"/>
+        </w:rPr>
+      </w:pPr>
+      <w:bookmarkStart w:id="24" w:name="_Toc234658234"/>
+      <w:r>
+        <w:rPr>
+          <w:lang w:val="es-DO"/>
+        </w:rPr>
         <w:t>Discusión</w:t>
       </w:r>
       <w:bookmarkEnd w:id="24"/>
@@ -9848,17 +10032,7 @@
           <w:szCs w:val="24"/>
           <w:lang w:eastAsia="es-DO"/>
         </w:rPr>
-        <w:t xml:space="preserve"> et al. (2017), quienes desarrollaron modelos predictivos sobre el Open University Learning Analytics Dataset (OULAD) para identificar estudiantes en riesgo de abandono desde las primeras semanas del período académico. En ambos estudios, la utilización de información generada en el entorno </w:t>
-      </w:r>
-      <w:r>
-        <w:rPr>
-          <w:rFonts w:ascii="Times New Roman" w:eastAsia="Times New Roman" w:hAnsi="Times New Roman" w:cs="Times New Roman"/>
-          <w:sz w:val="24"/>
-          <w:szCs w:val="24"/>
-          <w:lang w:eastAsia="es-DO"/>
-        </w:rPr>
-        <w:lastRenderedPageBreak/>
-        <w:t>virtual permitió alcanzar elevados niveles de precisión y demostró el potencial de los modelos predictivos para apoyar sistemas de alerta temprana en la educación superior.</w:t>
+        <w:t xml:space="preserve"> et al. (2017), quienes desarrollaron modelos predictivos sobre el Open University Learning Analytics Dataset (OULAD) para identificar estudiantes en riesgo de abandono desde las primeras semanas del período académico. En ambos estudios, la utilización de información generada en el entorno virtual permitió alcanzar elevados niveles de precisión y demostró el potencial de los modelos predictivos para apoyar sistemas de alerta temprana en la educación superior.</w:t>
       </w:r>
     </w:p>
     <w:p>
@@ -9909,7 +10083,17 @@
           <w:szCs w:val="24"/>
           <w:lang w:eastAsia="es-DO"/>
         </w:rPr>
-        <w:t xml:space="preserve"> señalaron que las variables demográficas y socioeconómicas actúan como factores moderadores del rendimiento académico cuando se combinan con indicadores de interacción en los entornos virtuales. Los resultados del presente estudio muestran un comportamiento similar, ya que las variables demográficas aportaron capacidad explicativa al modelo, aunque su influencia fue inferior a la ejercida por las variables relacionadas con la actividad académica desarrollada en la plataforma virtual.</w:t>
+        <w:t xml:space="preserve"> señalaron que las variables demográficas y socioeconómicas actúan como factores moderadores del rendimiento académico cuando se </w:t>
+      </w:r>
+      <w:r>
+        <w:rPr>
+          <w:rFonts w:ascii="Times New Roman" w:eastAsia="Times New Roman" w:hAnsi="Times New Roman" w:cs="Times New Roman"/>
+          <w:sz w:val="24"/>
+          <w:szCs w:val="24"/>
+          <w:lang w:eastAsia="es-DO"/>
+        </w:rPr>
+        <w:lastRenderedPageBreak/>
+        <w:t>combinan con indicadores de interacción en los entornos virtuales. Los resultados del presente estudio muestran un comportamiento similar, ya que las variables demográficas aportaron capacidad explicativa al modelo, aunque su influencia fue inferior a la ejercida por las variables relacionadas con la actividad académica desarrollada en la plataforma virtual.</w:t>
       </w:r>
     </w:p>
     <w:p>
@@ -10015,9 +10199,15 @@
     <w:p>
       <w:pPr>
         <w:pStyle w:val="Ttulo1"/>
-      </w:pPr>
-      <w:bookmarkStart w:id="25" w:name="_Toc234311736"/>
-      <w:r>
+        <w:rPr>
+          <w:lang w:val="es-DO"/>
+        </w:rPr>
+      </w:pPr>
+      <w:bookmarkStart w:id="25" w:name="_Toc234658235"/>
+      <w:r>
+        <w:rPr>
+          <w:lang w:val="es-DO"/>
+        </w:rPr>
         <w:t>Conclusiones</w:t>
       </w:r>
       <w:bookmarkEnd w:id="25"/>
@@ -10119,17 +10309,7 @@
           <w:szCs w:val="24"/>
           <w:lang w:eastAsia="es-DO"/>
         </w:rPr>
-        <w:t xml:space="preserve"> evidenció que las </w:t>
-      </w:r>
-      <w:r>
-        <w:rPr>
-          <w:rFonts w:ascii="Times New Roman" w:eastAsia="Times New Roman" w:hAnsi="Times New Roman" w:cs="Times New Roman"/>
-          <w:sz w:val="24"/>
-          <w:szCs w:val="24"/>
-          <w:lang w:eastAsia="es-DO"/>
-        </w:rPr>
-        <w:lastRenderedPageBreak/>
-        <w:t xml:space="preserve">variables relacionadas con la interacción de los estudiantes en el entorno virtual, especialmente el número de clics, la participación en actividades académicas y la frecuencia de acceso, presentan una mayor capacidad predictiva que las variables exclusivamente demográficas, reafirmando el valor del </w:t>
+        <w:t xml:space="preserve"> evidenció que las variables relacionadas con la interacción de los estudiantes en el entorno virtual, especialmente el número de clics, la participación en actividades académicas y la frecuencia de acceso, presentan una mayor capacidad predictiva que las variables exclusivamente demográficas, reafirmando el valor del </w:t>
       </w:r>
       <w:r>
         <w:rPr>
@@ -10219,7 +10399,17 @@
           <w:szCs w:val="24"/>
           <w:lang w:eastAsia="es-DO"/>
         </w:rPr>
-        <w:t xml:space="preserve"> obtuvo el mejor desempeño global, seguido por </w:t>
+        <w:t xml:space="preserve"> obtuvo el mejor desempeño global, </w:t>
+      </w:r>
+      <w:r>
+        <w:rPr>
+          <w:rFonts w:ascii="Times New Roman" w:eastAsia="Times New Roman" w:hAnsi="Times New Roman" w:cs="Times New Roman"/>
+          <w:sz w:val="24"/>
+          <w:szCs w:val="24"/>
+          <w:lang w:eastAsia="es-DO"/>
+        </w:rPr>
+        <w:lastRenderedPageBreak/>
+        <w:t xml:space="preserve">seguido por </w:t>
       </w:r>
       <w:proofErr w:type="spellStart"/>
       <w:r>
@@ -10469,7 +10659,7 @@
       <w:pPr>
         <w:pStyle w:val="Ttulo1"/>
       </w:pPr>
-      <w:bookmarkStart w:id="26" w:name="_Toc234311737"/>
+      <w:bookmarkStart w:id="26" w:name="_Toc234658236"/>
       <w:proofErr w:type="spellStart"/>
       <w:r>
         <w:lastRenderedPageBreak/>
@@ -11462,9 +11652,15 @@
     <w:p>
       <w:pPr>
         <w:pStyle w:val="Ttulo1"/>
-      </w:pPr>
-      <w:bookmarkStart w:id="27" w:name="_Toc234311738"/>
-      <w:r>
+        <w:rPr>
+          <w:lang w:val="es-DO"/>
+        </w:rPr>
+      </w:pPr>
+      <w:bookmarkStart w:id="27" w:name="_Toc234658237"/>
+      <w:r>
+        <w:rPr>
+          <w:lang w:val="es-DO"/>
+        </w:rPr>
         <w:lastRenderedPageBreak/>
         <w:t>Anexos</w:t>
       </w:r>
@@ -11473,9 +11669,15 @@
     <w:p>
       <w:pPr>
         <w:pStyle w:val="Ttulo1"/>
-      </w:pPr>
-      <w:bookmarkStart w:id="28" w:name="_Toc234311739"/>
-      <w:r>
+        <w:rPr>
+          <w:lang w:val="es-DO"/>
+        </w:rPr>
+      </w:pPr>
+      <w:bookmarkStart w:id="28" w:name="_Toc234658238"/>
+      <w:r>
+        <w:rPr>
+          <w:lang w:val="es-DO"/>
+        </w:rPr>
         <w:t>Anexo A. Código fuente en Python</w:t>
       </w:r>
       <w:bookmarkEnd w:id="28"/>
@@ -11484,6 +11686,31 @@
       <w:pPr>
         <w:widowControl w:val="0"/>
         <w:spacing w:before="100" w:beforeAutospacing="1" w:after="0" w:line="480" w:lineRule="auto"/>
+        <w:ind w:firstLine="708"/>
+        <w:rPr>
+          <w:rFonts w:ascii="Times New Roman" w:eastAsia="Times New Roman" w:hAnsi="Times New Roman" w:cs="Times New Roman"/>
+          <w:sz w:val="24"/>
+          <w:szCs w:val="24"/>
+          <w:lang w:eastAsia="es-DO"/>
+        </w:rPr>
+      </w:pPr>
+      <w:hyperlink r:id="rId13" w:history="1">
+        <w:r>
+          <w:rPr>
+            <w:rStyle w:val="Hipervnculo"/>
+            <w:rFonts w:ascii="Times New Roman" w:eastAsia="Times New Roman" w:hAnsi="Times New Roman" w:cs="Times New Roman"/>
+            <w:sz w:val="24"/>
+            <w:szCs w:val="24"/>
+            <w:lang w:eastAsia="es-DO"/>
+          </w:rPr>
+          <w:t>https://github.com/mudstart/cienciadedatos-I-trabajo-final</w:t>
+        </w:r>
+      </w:hyperlink>
+    </w:p>
+    <w:p>
+      <w:pPr>
+        <w:widowControl w:val="0"/>
+        <w:spacing w:after="0" w:line="480" w:lineRule="auto"/>
         <w:ind w:firstLine="708"/>
         <w:rPr>
           <w:rFonts w:ascii="Times New Roman" w:eastAsia="Times New Roman" w:hAnsi="Times New Roman" w:cs="Times New Roman"/>
@@ -11866,7 +12093,7 @@
       <w:pPr>
         <w:pStyle w:val="Ttulo1"/>
       </w:pPr>
-      <w:bookmarkStart w:id="29" w:name="_Toc234311740"/>
+      <w:bookmarkStart w:id="29" w:name="_Toc234658239"/>
       <w:r>
         <w:t xml:space="preserve">Anexo B. </w:t>
       </w:r>
@@ -12388,6 +12615,7 @@
                 <w:rFonts w:ascii="Times New Roman" w:eastAsia="Times New Roman" w:hAnsi="Times New Roman" w:cs="Times New Roman"/>
                 <w:lang w:eastAsia="es-DO"/>
               </w:rPr>
+              <w:lastRenderedPageBreak/>
               <w:t>PI2.csv</w:t>
             </w:r>
           </w:p>
@@ -12470,10 +12698,15 @@
     <w:p>
       <w:pPr>
         <w:pStyle w:val="Ttulo1"/>
-      </w:pPr>
-      <w:bookmarkStart w:id="30" w:name="_Toc234311741"/>
-      <w:r>
-        <w:lastRenderedPageBreak/>
+        <w:rPr>
+          <w:lang w:val="es-DO"/>
+        </w:rPr>
+      </w:pPr>
+      <w:bookmarkStart w:id="30" w:name="_Toc234658240"/>
+      <w:r>
+        <w:rPr>
+          <w:lang w:val="es-DO"/>
+        </w:rPr>
         <w:t>Anexo C. Matrices de confusión</w:t>
       </w:r>
       <w:bookmarkEnd w:id="30"/>
@@ -12498,6 +12731,31 @@
           <w:lang w:eastAsia="es-DO"/>
         </w:rPr>
         <w:t>Se incluyen las matrices de confusión correspondientes a cada uno de los modelos de clasificación implementados.</w:t>
+      </w:r>
+    </w:p>
+    <w:p>
+      <w:pPr>
+        <w:widowControl w:val="0"/>
+        <w:numPr>
+          <w:ilvl w:val="0"/>
+          <w:numId w:val="2"/>
+        </w:numPr>
+        <w:spacing w:after="100" w:afterAutospacing="1" w:line="240" w:lineRule="auto"/>
+        <w:rPr>
+          <w:rFonts w:ascii="Times New Roman" w:eastAsia="Times New Roman" w:hAnsi="Times New Roman" w:cs="Times New Roman"/>
+          <w:sz w:val="24"/>
+          <w:szCs w:val="24"/>
+          <w:lang w:eastAsia="es-DO"/>
+        </w:rPr>
+      </w:pPr>
+      <w:r>
+        <w:rPr>
+          <w:rFonts w:ascii="Times New Roman" w:eastAsia="Times New Roman" w:hAnsi="Times New Roman" w:cs="Times New Roman"/>
+          <w:sz w:val="24"/>
+          <w:szCs w:val="24"/>
+          <w:lang w:eastAsia="es-DO"/>
+        </w:rPr>
+        <w:t xml:space="preserve">Regresión Logística. </w:t>
       </w:r>
     </w:p>
     <w:p>
@@ -12515,14 +12773,25 @@
           <w:lang w:eastAsia="es-DO"/>
         </w:rPr>
       </w:pPr>
-      <w:r>
-        <w:rPr>
-          <w:rFonts w:ascii="Times New Roman" w:eastAsia="Times New Roman" w:hAnsi="Times New Roman" w:cs="Times New Roman"/>
-          <w:sz w:val="24"/>
-          <w:szCs w:val="24"/>
-          <w:lang w:eastAsia="es-DO"/>
-        </w:rPr>
-        <w:t xml:space="preserve">Regresión Logística. </w:t>
+      <w:proofErr w:type="spellStart"/>
+      <w:r>
+        <w:rPr>
+          <w:rFonts w:ascii="Times New Roman" w:eastAsia="Times New Roman" w:hAnsi="Times New Roman" w:cs="Times New Roman"/>
+          <w:sz w:val="24"/>
+          <w:szCs w:val="24"/>
+          <w:lang w:eastAsia="es-DO"/>
+        </w:rPr>
+        <w:t>Random</w:t>
+      </w:r>
+      <w:proofErr w:type="spellEnd"/>
+      <w:r>
+        <w:rPr>
+          <w:rFonts w:ascii="Times New Roman" w:eastAsia="Times New Roman" w:hAnsi="Times New Roman" w:cs="Times New Roman"/>
+          <w:sz w:val="24"/>
+          <w:szCs w:val="24"/>
+          <w:lang w:eastAsia="es-DO"/>
+        </w:rPr>
+        <w:t xml:space="preserve"> Forest. </w:t>
       </w:r>
     </w:p>
     <w:p>
@@ -12548,42 +12817,6 @@
           <w:szCs w:val="24"/>
           <w:lang w:eastAsia="es-DO"/>
         </w:rPr>
-        <w:t>Random</w:t>
-      </w:r>
-      <w:proofErr w:type="spellEnd"/>
-      <w:r>
-        <w:rPr>
-          <w:rFonts w:ascii="Times New Roman" w:eastAsia="Times New Roman" w:hAnsi="Times New Roman" w:cs="Times New Roman"/>
-          <w:sz w:val="24"/>
-          <w:szCs w:val="24"/>
-          <w:lang w:eastAsia="es-DO"/>
-        </w:rPr>
-        <w:t xml:space="preserve"> Forest. </w:t>
-      </w:r>
-    </w:p>
-    <w:p>
-      <w:pPr>
-        <w:widowControl w:val="0"/>
-        <w:numPr>
-          <w:ilvl w:val="0"/>
-          <w:numId w:val="2"/>
-        </w:numPr>
-        <w:spacing w:before="100" w:beforeAutospacing="1" w:after="100" w:afterAutospacing="1" w:line="240" w:lineRule="auto"/>
-        <w:rPr>
-          <w:rFonts w:ascii="Times New Roman" w:eastAsia="Times New Roman" w:hAnsi="Times New Roman" w:cs="Times New Roman"/>
-          <w:sz w:val="24"/>
-          <w:szCs w:val="24"/>
-          <w:lang w:eastAsia="es-DO"/>
-        </w:rPr>
-      </w:pPr>
-      <w:proofErr w:type="spellStart"/>
-      <w:r>
-        <w:rPr>
-          <w:rFonts w:ascii="Times New Roman" w:eastAsia="Times New Roman" w:hAnsi="Times New Roman" w:cs="Times New Roman"/>
-          <w:sz w:val="24"/>
-          <w:szCs w:val="24"/>
-          <w:lang w:eastAsia="es-DO"/>
-        </w:rPr>
         <w:t>Gradient</w:t>
       </w:r>
       <w:proofErr w:type="spellEnd"/>
@@ -12763,9 +12996,15 @@
     <w:p>
       <w:pPr>
         <w:pStyle w:val="Ttulo1"/>
-      </w:pPr>
-      <w:bookmarkStart w:id="31" w:name="_Toc234311742"/>
-      <w:r>
+        <w:rPr>
+          <w:lang w:val="es-DO"/>
+        </w:rPr>
+      </w:pPr>
+      <w:bookmarkStart w:id="31" w:name="_Toc234658241"/>
+      <w:r>
+        <w:rPr>
+          <w:lang w:val="es-DO"/>
+        </w:rPr>
         <w:t>Anexo D. Evidencias experimentales</w:t>
       </w:r>
       <w:bookmarkEnd w:id="31"/>
@@ -13032,7 +13271,7 @@
       <w:pPr>
         <w:pStyle w:val="Ttulo1"/>
       </w:pPr>
-      <w:bookmarkStart w:id="32" w:name="_Toc234311743"/>
+      <w:bookmarkStart w:id="32" w:name="_Toc234658242"/>
       <w:r>
         <w:t xml:space="preserve">Anexo E. </w:t>
       </w:r>
@@ -13131,6 +13370,7 @@
           <w:szCs w:val="24"/>
           <w:lang w:eastAsia="es-DO"/>
         </w:rPr>
+        <w:lastRenderedPageBreak/>
         <w:t xml:space="preserve">Learning Analytics. </w:t>
       </w:r>
     </w:p>
@@ -13156,7 +13396,6 @@
           <w:szCs w:val="24"/>
           <w:lang w:eastAsia="es-DO"/>
         </w:rPr>
-        <w:lastRenderedPageBreak/>
         <w:t xml:space="preserve">Dataset OULAD. </w:t>
       </w:r>
     </w:p>
@@ -13371,9 +13610,9 @@
           <w:noProof/>
         </w:rPr>
         <w:drawing>
-          <wp:inline distT="0" distB="0" distL="0" distR="0" wp14:anchorId="7924609E" wp14:editId="64426E4E">
-            <wp:extent cx="4571365" cy="5575300"/>
-            <wp:effectExtent l="0" t="0" r="635" b="6350"/>
+          <wp:inline distT="0" distB="0" distL="0" distR="0" wp14:anchorId="7924609E" wp14:editId="5357848D">
+            <wp:extent cx="4375657" cy="5336612"/>
+            <wp:effectExtent l="0" t="0" r="6350" b="0"/>
             <wp:docPr id="2" name="Imagen 2"/>
             <wp:cNvGraphicFramePr>
               <a:graphicFrameLocks xmlns:a="http://schemas.openxmlformats.org/drawingml/2006/main" noChangeAspect="1"/>
@@ -13388,7 +13627,7 @@
                     </pic:cNvPicPr>
                   </pic:nvPicPr>
                   <pic:blipFill>
-                    <a:blip r:embed="rId13" cstate="print">
+                    <a:blip r:embed="rId14" cstate="print">
                       <a:extLst>
                         <a:ext uri="{28A0092B-C50C-407E-A947-70E740481C1C}">
                           <a14:useLocalDpi xmlns:a14="http://schemas.microsoft.com/office/drawing/2010/main" val="0"/>
@@ -13403,7 +13642,7 @@
                   <pic:spPr bwMode="auto">
                     <a:xfrm>
                       <a:off x="0" y="0"/>
-                      <a:ext cx="4605341" cy="5616738"/>
+                      <a:ext cx="4414157" cy="5383568"/>
                     </a:xfrm>
                     <a:prstGeom prst="rect">
                       <a:avLst/>
@@ -13425,9 +13664,10 @@
         <w:widowControl w:val="0"/>
         <w:spacing w:after="0" w:line="240" w:lineRule="auto"/>
         <w:rPr>
-          <w:rFonts w:ascii="Times New Roman" w:hAnsi="Times New Roman" w:cs="Times New Roman"/>
-          <w:sz w:val="24"/>
-          <w:szCs w:val="24"/>
+          <w:rFonts w:ascii="Times New Roman" w:eastAsia="Times New Roman" w:hAnsi="Times New Roman" w:cs="Times New Roman"/>
+          <w:sz w:val="24"/>
+          <w:szCs w:val="24"/>
+          <w:lang w:eastAsia="es-DO"/>
         </w:rPr>
       </w:pPr>
       <w:r>
@@ -13451,10 +13691,70 @@
         <w:t xml:space="preserve"> Elaboración propia.</w:t>
       </w:r>
     </w:p>
+    <w:p>
+      <w:pPr>
+        <w:widowControl w:val="0"/>
+        <w:spacing w:after="0" w:line="240" w:lineRule="auto"/>
+        <w:rPr>
+          <w:rFonts w:ascii="Times New Roman" w:eastAsia="Times New Roman" w:hAnsi="Times New Roman" w:cs="Times New Roman"/>
+          <w:sz w:val="24"/>
+          <w:szCs w:val="24"/>
+          <w:lang w:eastAsia="es-DO"/>
+        </w:rPr>
+      </w:pPr>
+    </w:p>
+    <w:p>
+      <w:pPr>
+        <w:pStyle w:val="Ttulo1"/>
+      </w:pPr>
+      <w:bookmarkStart w:id="33" w:name="_Toc234658243"/>
+      <w:r>
+        <w:t xml:space="preserve">Anexo </w:t>
+      </w:r>
+      <w:r>
+        <w:t>F. Video grupal</w:t>
+      </w:r>
+      <w:bookmarkEnd w:id="33"/>
+      <w:r>
+        <w:t xml:space="preserve"> </w:t>
+      </w:r>
+    </w:p>
+    <w:p>
+      <w:pPr>
+        <w:widowControl w:val="0"/>
+        <w:spacing w:after="0" w:line="240" w:lineRule="auto"/>
+        <w:rPr>
+          <w:rFonts w:ascii="Times New Roman" w:hAnsi="Times New Roman" w:cs="Times New Roman"/>
+          <w:sz w:val="24"/>
+          <w:szCs w:val="24"/>
+        </w:rPr>
+      </w:pPr>
+      <w:hyperlink r:id="rId15" w:history="1">
+        <w:r>
+          <w:rPr>
+            <w:rStyle w:val="Hipervnculo"/>
+            <w:rFonts w:ascii="Times New Roman" w:eastAsia="Times New Roman" w:hAnsi="Times New Roman" w:cs="Times New Roman"/>
+            <w:sz w:val="24"/>
+            <w:szCs w:val="24"/>
+            <w:lang w:eastAsia="es-DO"/>
+          </w:rPr>
+          <w:t>https://youtu.be/EKgiOwEy9W0</w:t>
+        </w:r>
+      </w:hyperlink>
+      <w:r>
+        <w:rPr>
+          <w:rFonts w:ascii="Times New Roman" w:eastAsia="Times New Roman" w:hAnsi="Times New Roman" w:cs="Times New Roman"/>
+          <w:sz w:val="24"/>
+          <w:szCs w:val="24"/>
+          <w:lang w:eastAsia="es-DO"/>
+        </w:rPr>
+        <w:t xml:space="preserve"> </w:t>
+      </w:r>
+    </w:p>
     <w:sectPr>
-      <w:headerReference w:type="default" r:id="rId14"/>
-      <w:footerReference w:type="default" r:id="rId15"/>
-      <w:headerReference w:type="first" r:id="rId16"/>
+      <w:headerReference w:type="default" r:id="rId16"/>
+      <w:footerReference w:type="default" r:id="rId17"/>
+      <w:headerReference w:type="first" r:id="rId18"/>
       <w:pgSz w:w="12240" w:h="15840" w:code="1"/>
       <w:pgMar w:top="1418" w:right="1418" w:bottom="1418" w:left="1418" w:header="709" w:footer="709" w:gutter="0"/>
       <w:pgNumType w:start="1"/>
@@ -14967,10 +15267,10 @@
     <w:autoRedefine/>
     <w:uiPriority w:val="9"/>
     <w:qFormat/>
-    <w:rsid w:val="003462A5"/>
+    <w:rsid w:val="00063E4C"/>
     <w:pPr>
       <w:widowControl w:val="0"/>
-      <w:spacing w:before="240" w:after="240"/>
+      <w:spacing w:after="240"/>
       <w:outlineLvl w:val="0"/>
     </w:pPr>
     <w:rPr>
@@ -15103,7 +15403,7 @@
     <w:basedOn w:val="Fuentedeprrafopredeter"/>
     <w:link w:val="Ttulo1"/>
     <w:uiPriority w:val="9"/>
-    <w:rsid w:val="003462A5"/>
+    <w:rsid w:val="00063E4C"/>
     <w:rPr>
       <w:rFonts w:ascii="Times New Roman" w:eastAsia="Times New Roman" w:hAnsi="Times New Roman" w:cstheme="majorBidi"/>
       <w:b/>

</xml_diff>